<commit_message>
docs: update project report and add round 3 review notes
- presentation/Ragent项目改进报告.docx: updated project improvement report
- docs/research/review_round_3.md: add third round review feedback
</commit_message>
<xml_diff>
--- a/presentation/Ragent项目改进报告.docx
+++ b/presentation/Ragent项目改进报告.docx
@@ -28,1391 +28,620 @@
         <w:p>
           <w:pPr>
             <w:pStyle w:val="TOC"/>
-            <w:spacing w:line="360" w:lineRule="auto"/>
-            <w:jc w:val="center"/>
-            <w:rPr>
-              <w:rFonts w:ascii="Times New Roman" w:eastAsia="宋体" w:hAnsi="Times New Roman" w:cs="Times New Roman"/>
-              <w:color w:val="auto"/>
-            </w:rPr>
           </w:pPr>
           <w:r>
-            <w:rPr>
-              <w:rFonts w:ascii="Times New Roman" w:eastAsia="宋体" w:hAnsi="Times New Roman" w:cs="Times New Roman"/>
-              <w:color w:val="auto"/>
-              <w:lang w:val="zh-CN"/>
-            </w:rPr>
-            <w:t xml:space="preserve">Table of Contents </w:t>
-          </w:r>
-          <w:r>
-            <w:rPr>
-              <w:rFonts w:ascii="Times New Roman" w:eastAsia="宋体" w:hAnsi="Times New Roman" w:cs="Times New Roman"/>
-              <w:color w:val="auto"/>
-              <w:lang w:val="zh-CN"/>
-            </w:rPr>
-            <w:t>目</w:t>
-          </w:r>
-          <w:r>
-            <w:rPr>
-              <w:rFonts w:ascii="Times New Roman" w:eastAsia="宋体" w:hAnsi="Times New Roman" w:cs="Times New Roman"/>
-              <w:color w:val="auto"/>
-              <w:lang w:val="zh-CN"/>
-            </w:rPr>
-            <w:t xml:space="preserve">  </w:t>
-          </w:r>
-          <w:r>
-            <w:rPr>
-              <w:rFonts w:ascii="Times New Roman" w:eastAsia="宋体" w:hAnsi="Times New Roman" w:cs="Times New Roman"/>
-              <w:color w:val="auto"/>
-              <w:lang w:val="zh-CN"/>
-            </w:rPr>
-            <w:t>录</w:t>
+            <w:t>Table of Contents 目  录</w:t>
           </w:r>
         </w:p>
         <w:p>
           <w:pPr>
             <w:pStyle w:val="TOC1"/>
-            <w:tabs>
-              <w:tab w:val="right" w:leader="dot" w:pos="9010"/>
-            </w:tabs>
-            <w:spacing w:line="360" w:lineRule="auto"/>
-            <w:rPr>
-              <w:rFonts w:asciiTheme="minorHAnsi" w:eastAsiaTheme="minorEastAsia" w:hAnsiTheme="minorHAnsi" w:cstheme="minorBidi"/>
-              <w:noProof/>
-              <w:kern w:val="2"/>
-              <w:sz w:val="22"/>
-              <w:szCs w:val="24"/>
-              <w14:ligatures w14:val="standardContextual"/>
-            </w:rPr>
           </w:pPr>
-          <w:hyperlink>
-            <w:r>
-              <w:rPr>
-                <w:rStyle w:val="aff0"/>
-                <w:noProof/>
-              </w:rPr>
-              <w:t xml:space="preserve">Table of contents for the figure </w:t>
-            </w:r>
-            <w:r>
-              <w:rPr>
-                <w:rStyle w:val="aff0"/>
-                <w:noProof/>
-              </w:rPr>
-              <w:t>图目录</w:t>
-            </w:r>
-            <w:r>
-              <w:rPr>
-                <w:noProof/>
-              </w:rPr>
-              <w:tab/>
-              <w:t>2</w:t>
-            </w:r>
-          </w:hyperlink>
+          <w:r>
+            <w:tab/>
+          </w:r>
+          <w:r>
+            <w:tab/>
+          </w:r>
+          <w:r>
+            <w:t>1 简介</w:t>
+          </w:r>
+          <w:r>
+            <w:tab/>
+          </w:r>
+          <w:r>
+            <w:t>4</w:t>
+          </w:r>
+        </w:p>
+        <w:p>
+          <w:pPr>
+            <w:pStyle w:val="TOC2"/>
+          </w:pPr>
+          <w:r>
+            <w:t>1.1 目的</w:t>
+          </w:r>
+          <w:r>
+            <w:tab/>
+          </w:r>
+          <w:r>
+            <w:t>4</w:t>
+          </w:r>
+        </w:p>
+        <w:p>
+          <w:pPr>
+            <w:pStyle w:val="TOC2"/>
+          </w:pPr>
+          <w:r>
+            <w:t>1.2 当前的局限性</w:t>
+          </w:r>
+          <w:r>
+            <w:tab/>
+          </w:r>
+          <w:r>
+            <w:t>4</w:t>
+          </w:r>
+        </w:p>
+        <w:p>
+          <w:pPr>
+            <w:pStyle w:val="TOC2"/>
+          </w:pPr>
+          <w:r>
+            <w:t>1.3 挑战与需求</w:t>
+          </w:r>
+          <w:r>
+            <w:tab/>
+          </w:r>
+          <w:r>
+            <w:t>4</w:t>
+          </w:r>
         </w:p>
         <w:p>
           <w:pPr>
             <w:pStyle w:val="TOC1"/>
-            <w:tabs>
-              <w:tab w:val="left" w:pos="453"/>
-              <w:tab w:val="right" w:leader="dot" w:pos="9010"/>
-            </w:tabs>
-            <w:spacing w:line="360" w:lineRule="auto"/>
-            <w:rPr>
-              <w:rFonts w:asciiTheme="minorHAnsi" w:eastAsiaTheme="minorEastAsia" w:hAnsiTheme="minorHAnsi" w:cstheme="minorBidi"/>
-              <w:noProof/>
-              <w:kern w:val="2"/>
-              <w:sz w:val="22"/>
-              <w:szCs w:val="24"/>
-              <w14:ligatures w14:val="standardContextual"/>
-            </w:rPr>
           </w:pPr>
-          <w:hyperlink>
-            <w:r>
-              <w:rPr>
-                <w:rStyle w:val="aff0"/>
-                <w:noProof/>
-              </w:rPr>
-              <w:t xml:space="preserve">1 </w:t>
-            </w:r>
-            <w:r>
-              <w:rPr>
-                <w:rStyle w:val="aff0"/>
-                <w:noProof/>
-              </w:rPr>
-              <w:t>简介</w:t>
-            </w:r>
-            <w:r>
-              <w:rPr>
-                <w:noProof/>
-              </w:rPr>
-              <w:tab/>
-              <w:t>4</w:t>
-            </w:r>
-          </w:hyperlink>
+          <w:r>
+            <w:tab/>
+          </w:r>
+          <w:r>
+            <w:tab/>
+          </w:r>
+          <w:r>
+            <w:t>2 算法背景</w:t>
+          </w:r>
+          <w:r>
+            <w:tab/>
+          </w:r>
+          <w:r>
+            <w:t>4</w:t>
+          </w:r>
         </w:p>
         <w:p>
           <w:pPr>
             <w:pStyle w:val="TOC2"/>
-            <w:spacing w:line="360" w:lineRule="auto"/>
-            <w:rPr>
-              <w:rFonts w:asciiTheme="minorHAnsi" w:eastAsiaTheme="minorEastAsia" w:hAnsiTheme="minorHAnsi" w:cstheme="minorBidi"/>
-              <w:noProof/>
-              <w:kern w:val="2"/>
-              <w:sz w:val="22"/>
-              <w:szCs w:val="24"/>
-              <w14:ligatures w14:val="standardContextual"/>
-            </w:rPr>
           </w:pPr>
-          <w:hyperlink>
-            <w:r>
-              <w:rPr>
-                <w:rStyle w:val="aff0"/>
-                <w:noProof/>
-              </w:rPr>
-              <w:t xml:space="preserve">1.1 </w:t>
-            </w:r>
-            <w:r>
-              <w:rPr>
-                <w:rStyle w:val="aff0"/>
-                <w:noProof/>
-              </w:rPr>
-              <w:t>目的</w:t>
-            </w:r>
-            <w:r>
-              <w:rPr>
-                <w:noProof/>
-              </w:rPr>
-              <w:tab/>
-              <w:t>4</w:t>
-            </w:r>
-          </w:hyperlink>
+          <w:r>
+            <w:t>2.1 传统 RAG 与 GraphRAG 的演进脉络</w:t>
+          </w:r>
+          <w:r>
+            <w:tab/>
+          </w:r>
+          <w:r>
+            <w:t>4</w:t>
+          </w:r>
         </w:p>
         <w:p>
           <w:pPr>
             <w:pStyle w:val="TOC2"/>
-            <w:spacing w:line="360" w:lineRule="auto"/>
-            <w:rPr>
-              <w:rFonts w:asciiTheme="minorHAnsi" w:eastAsiaTheme="minorEastAsia" w:hAnsiTheme="minorHAnsi" w:cstheme="minorBidi"/>
-              <w:noProof/>
-              <w:kern w:val="2"/>
-              <w:sz w:val="22"/>
-              <w:szCs w:val="24"/>
-              <w14:ligatures w14:val="standardContextual"/>
-            </w:rPr>
           </w:pPr>
-          <w:hyperlink>
-            <w:r>
-              <w:rPr>
-                <w:rStyle w:val="aff0"/>
-                <w:noProof/>
-              </w:rPr>
-              <w:t xml:space="preserve">1.2 </w:t>
-            </w:r>
-            <w:r>
-              <w:rPr>
-                <w:rStyle w:val="aff0"/>
-                <w:noProof/>
-              </w:rPr>
-              <w:t>当前的局限性</w:t>
-            </w:r>
-            <w:r>
-              <w:rPr>
-                <w:noProof/>
-              </w:rPr>
-              <w:tab/>
-              <w:t>4</w:t>
-            </w:r>
-          </w:hyperlink>
+          <w:r>
+            <w:t>2.2 专业文档的结构化解析需求</w:t>
+          </w:r>
+          <w:r>
+            <w:tab/>
+          </w:r>
+          <w:r>
+            <w:t>5</w:t>
+          </w:r>
         </w:p>
         <w:p>
           <w:pPr>
             <w:pStyle w:val="TOC2"/>
-            <w:spacing w:line="360" w:lineRule="auto"/>
-            <w:rPr>
-              <w:rFonts w:asciiTheme="minorHAnsi" w:eastAsiaTheme="minorEastAsia" w:hAnsiTheme="minorHAnsi" w:cstheme="minorBidi"/>
-              <w:noProof/>
-              <w:kern w:val="2"/>
-              <w:sz w:val="22"/>
-              <w:szCs w:val="24"/>
-              <w14:ligatures w14:val="standardContextual"/>
-            </w:rPr>
           </w:pPr>
-          <w:hyperlink>
-            <w:r>
-              <w:rPr>
-                <w:rStyle w:val="aff0"/>
-                <w:noProof/>
-              </w:rPr>
-              <w:t xml:space="preserve">1.3 </w:t>
-            </w:r>
-            <w:r>
-              <w:rPr>
-                <w:rStyle w:val="aff0"/>
-                <w:noProof/>
-              </w:rPr>
-              <w:t>挑战与需求</w:t>
-            </w:r>
-            <w:r>
-              <w:rPr>
-                <w:noProof/>
-              </w:rPr>
-              <w:tab/>
-              <w:t>4</w:t>
-            </w:r>
-          </w:hyperlink>
+          <w:r>
+            <w:t>2.3 可解释检索与证据覆盖的重要性</w:t>
+          </w:r>
+          <w:r>
+            <w:tab/>
+          </w:r>
+          <w:r>
+            <w:t>5</w:t>
+          </w:r>
         </w:p>
         <w:p>
           <w:pPr>
             <w:pStyle w:val="TOC1"/>
-            <w:tabs>
-              <w:tab w:val="left" w:pos="453"/>
-              <w:tab w:val="right" w:leader="dot" w:pos="9010"/>
-            </w:tabs>
-            <w:spacing w:line="360" w:lineRule="auto"/>
-            <w:rPr>
-              <w:rFonts w:asciiTheme="minorHAnsi" w:eastAsiaTheme="minorEastAsia" w:hAnsiTheme="minorHAnsi" w:cstheme="minorBidi"/>
-              <w:noProof/>
-              <w:kern w:val="2"/>
-              <w:sz w:val="22"/>
-              <w:szCs w:val="24"/>
-              <w14:ligatures w14:val="standardContextual"/>
-            </w:rPr>
           </w:pPr>
-          <w:hyperlink>
-            <w:r>
-              <w:rPr>
-                <w:rStyle w:val="aff0"/>
-                <w:noProof/>
-              </w:rPr>
-              <w:t xml:space="preserve">2 </w:t>
-            </w:r>
-            <w:r>
-              <w:rPr>
-                <w:rStyle w:val="aff0"/>
-                <w:noProof/>
-              </w:rPr>
-              <w:t>算法背景</w:t>
-            </w:r>
-            <w:r>
-              <w:rPr>
-                <w:noProof/>
-              </w:rPr>
-              <w:tab/>
-              <w:t>4</w:t>
-            </w:r>
-          </w:hyperlink>
+          <w:r>
+            <w:tab/>
+          </w:r>
+          <w:r>
+            <w:tab/>
+          </w:r>
+          <w:r>
+            <w:t>3 当前业界研究进展</w:t>
+          </w:r>
+          <w:r>
+            <w:tab/>
+          </w:r>
+          <w:r>
+            <w:t>5</w:t>
+          </w:r>
         </w:p>
         <w:p>
           <w:pPr>
             <w:pStyle w:val="TOC2"/>
-            <w:spacing w:line="360" w:lineRule="auto"/>
-            <w:rPr>
-              <w:rFonts w:asciiTheme="minorHAnsi" w:eastAsiaTheme="minorEastAsia" w:hAnsiTheme="minorHAnsi" w:cstheme="minorBidi"/>
-              <w:noProof/>
-              <w:kern w:val="2"/>
-              <w:sz w:val="22"/>
-              <w:szCs w:val="24"/>
-              <w14:ligatures w14:val="standardContextual"/>
-            </w:rPr>
           </w:pPr>
-          <w:hyperlink>
-            <w:r>
-              <w:rPr>
-                <w:rStyle w:val="aff0"/>
-                <w:noProof/>
-              </w:rPr>
-              <w:t xml:space="preserve">2.1 </w:t>
-            </w:r>
-            <w:r>
-              <w:rPr>
-                <w:rStyle w:val="aff0"/>
-                <w:noProof/>
-              </w:rPr>
-              <w:t>传统</w:t>
-            </w:r>
-            <w:r>
-              <w:rPr>
-                <w:rStyle w:val="aff0"/>
-                <w:noProof/>
-              </w:rPr>
-              <w:t xml:space="preserve"> RAG </w:t>
-            </w:r>
-            <w:r>
-              <w:rPr>
-                <w:rStyle w:val="aff0"/>
-                <w:noProof/>
-              </w:rPr>
-              <w:t>与</w:t>
-            </w:r>
-            <w:r>
-              <w:rPr>
-                <w:rStyle w:val="aff0"/>
-                <w:noProof/>
-              </w:rPr>
-              <w:t xml:space="preserve"> GraphRAG </w:t>
-            </w:r>
-            <w:r>
-              <w:rPr>
-                <w:rStyle w:val="aff0"/>
-                <w:noProof/>
-              </w:rPr>
-              <w:t>的演进脉络</w:t>
-            </w:r>
-            <w:r>
-              <w:rPr>
-                <w:noProof/>
-              </w:rPr>
-              <w:tab/>
-              <w:t>4</w:t>
-            </w:r>
-          </w:hyperlink>
+          <w:r>
+            <w:t>3.1 知识图谱增强检索的发展方向</w:t>
+          </w:r>
+          <w:r>
+            <w:tab/>
+          </w:r>
+          <w:r>
+            <w:t>5</w:t>
+          </w:r>
         </w:p>
         <w:p>
           <w:pPr>
             <w:pStyle w:val="TOC2"/>
-            <w:spacing w:line="360" w:lineRule="auto"/>
-            <w:rPr>
-              <w:rFonts w:asciiTheme="minorHAnsi" w:eastAsiaTheme="minorEastAsia" w:hAnsiTheme="minorHAnsi" w:cstheme="minorBidi"/>
-              <w:noProof/>
-              <w:kern w:val="2"/>
-              <w:sz w:val="22"/>
-              <w:szCs w:val="24"/>
-              <w14:ligatures w14:val="standardContextual"/>
-            </w:rPr>
           </w:pPr>
-          <w:hyperlink>
-            <w:r>
-              <w:rPr>
-                <w:rStyle w:val="aff0"/>
-                <w:noProof/>
-              </w:rPr>
-              <w:t xml:space="preserve">2.2 </w:t>
-            </w:r>
-            <w:r>
-              <w:rPr>
-                <w:rStyle w:val="aff0"/>
-                <w:noProof/>
-              </w:rPr>
-              <w:t>专业文档的结构化解析需求</w:t>
-            </w:r>
-            <w:r>
-              <w:rPr>
-                <w:noProof/>
-              </w:rPr>
-              <w:tab/>
-              <w:t>4</w:t>
-            </w:r>
-          </w:hyperlink>
+          <w:r>
+            <w:t>3.2 多模态文档解析与结构化索引进展</w:t>
+          </w:r>
+          <w:r>
+            <w:tab/>
+          </w:r>
+          <w:r>
+            <w:t>5</w:t>
+          </w:r>
         </w:p>
         <w:p>
           <w:pPr>
             <w:pStyle w:val="TOC2"/>
-            <w:spacing w:line="360" w:lineRule="auto"/>
-            <w:rPr>
-              <w:rFonts w:asciiTheme="minorHAnsi" w:eastAsiaTheme="minorEastAsia" w:hAnsiTheme="minorHAnsi" w:cstheme="minorBidi"/>
-              <w:noProof/>
-              <w:kern w:val="2"/>
-              <w:sz w:val="22"/>
-              <w:szCs w:val="24"/>
-              <w14:ligatures w14:val="standardContextual"/>
-            </w:rPr>
           </w:pPr>
-          <w:hyperlink>
-            <w:r>
-              <w:rPr>
-                <w:rStyle w:val="aff0"/>
-                <w:noProof/>
-              </w:rPr>
-              <w:t xml:space="preserve">2.3 </w:t>
-            </w:r>
-            <w:r>
-              <w:rPr>
-                <w:rStyle w:val="aff0"/>
-                <w:noProof/>
-              </w:rPr>
-              <w:t>可解释检索与证据覆盖的重要性</w:t>
-            </w:r>
-            <w:r>
-              <w:rPr>
-                <w:noProof/>
-              </w:rPr>
-              <w:tab/>
-              <w:t>4</w:t>
-            </w:r>
-          </w:hyperlink>
+          <w:r>
+            <w:t>3.3 可解释问答与工作台化趋势</w:t>
+          </w:r>
+          <w:r>
+            <w:tab/>
+          </w:r>
+          <w:r>
+            <w:t>6</w:t>
+          </w:r>
         </w:p>
         <w:p>
           <w:pPr>
             <w:pStyle w:val="TOC1"/>
-            <w:tabs>
-              <w:tab w:val="left" w:pos="453"/>
-              <w:tab w:val="right" w:leader="dot" w:pos="9010"/>
-            </w:tabs>
-            <w:spacing w:line="360" w:lineRule="auto"/>
-            <w:rPr>
-              <w:rFonts w:asciiTheme="minorHAnsi" w:eastAsiaTheme="minorEastAsia" w:hAnsiTheme="minorHAnsi" w:cstheme="minorBidi"/>
-              <w:noProof/>
-              <w:kern w:val="2"/>
-              <w:sz w:val="22"/>
-              <w:szCs w:val="24"/>
-              <w14:ligatures w14:val="standardContextual"/>
-            </w:rPr>
           </w:pPr>
-          <w:hyperlink>
-            <w:r>
-              <w:rPr>
-                <w:rStyle w:val="aff0"/>
-                <w:noProof/>
-              </w:rPr>
-              <w:t xml:space="preserve">3 </w:t>
-            </w:r>
-            <w:r>
-              <w:rPr>
-                <w:rStyle w:val="aff0"/>
-                <w:noProof/>
-              </w:rPr>
-              <w:t>当前业界研究进展</w:t>
-            </w:r>
-            <w:r>
-              <w:rPr>
-                <w:noProof/>
-              </w:rPr>
-              <w:tab/>
-              <w:t>5</w:t>
-            </w:r>
-          </w:hyperlink>
+          <w:r>
+            <w:tab/>
+          </w:r>
+          <w:r>
+            <w:tab/>
+          </w:r>
+          <w:r>
+            <w:t>4 算法设计与实现</w:t>
+          </w:r>
+          <w:r>
+            <w:tab/>
+          </w:r>
+          <w:r>
+            <w:t>6</w:t>
+          </w:r>
         </w:p>
         <w:p>
           <w:pPr>
             <w:pStyle w:val="TOC2"/>
-            <w:spacing w:line="360" w:lineRule="auto"/>
-            <w:rPr>
-              <w:rFonts w:asciiTheme="minorHAnsi" w:eastAsiaTheme="minorEastAsia" w:hAnsiTheme="minorHAnsi" w:cstheme="minorBidi"/>
-              <w:noProof/>
-              <w:kern w:val="2"/>
-              <w:sz w:val="22"/>
-              <w:szCs w:val="24"/>
-              <w14:ligatures w14:val="standardContextual"/>
-            </w:rPr>
           </w:pPr>
-          <w:hyperlink>
-            <w:r>
-              <w:rPr>
-                <w:rStyle w:val="aff0"/>
-                <w:noProof/>
-              </w:rPr>
-              <w:t xml:space="preserve">3.1 </w:t>
-            </w:r>
-            <w:r>
-              <w:rPr>
-                <w:rStyle w:val="aff0"/>
-                <w:noProof/>
-              </w:rPr>
-              <w:t>知识图谱增强检索的发展方向</w:t>
-            </w:r>
-            <w:r>
-              <w:rPr>
-                <w:noProof/>
-              </w:rPr>
-              <w:tab/>
-              <w:t>5</w:t>
-            </w:r>
-          </w:hyperlink>
+          <w:r>
+            <w:t>4.1 关键技术与创新</w:t>
+          </w:r>
+          <w:r>
+            <w:tab/>
+          </w:r>
+          <w:r>
+            <w:t>6</w:t>
+          </w:r>
         </w:p>
         <w:p>
           <w:pPr>
             <w:pStyle w:val="TOC2"/>
-            <w:spacing w:line="360" w:lineRule="auto"/>
-            <w:rPr>
-              <w:rFonts w:asciiTheme="minorHAnsi" w:eastAsiaTheme="minorEastAsia" w:hAnsiTheme="minorHAnsi" w:cstheme="minorBidi"/>
-              <w:noProof/>
-              <w:kern w:val="2"/>
-              <w:sz w:val="22"/>
-              <w:szCs w:val="24"/>
-              <w14:ligatures w14:val="standardContextual"/>
-            </w:rPr>
           </w:pPr>
-          <w:hyperlink>
-            <w:r>
-              <w:rPr>
-                <w:rStyle w:val="aff0"/>
-                <w:noProof/>
-              </w:rPr>
-              <w:t xml:space="preserve">3.2 </w:t>
-            </w:r>
-            <w:r>
-              <w:rPr>
-                <w:rStyle w:val="aff0"/>
-                <w:noProof/>
-              </w:rPr>
-              <w:t>多模态文档解析与结构化索引进展</w:t>
-            </w:r>
-            <w:r>
-              <w:rPr>
-                <w:noProof/>
-              </w:rPr>
-              <w:tab/>
-              <w:t>5</w:t>
-            </w:r>
-          </w:hyperlink>
+          <w:r>
+            <w:t>4.2 算法原理及技术实现</w:t>
+          </w:r>
+          <w:r>
+            <w:tab/>
+          </w:r>
+          <w:r>
+            <w:t>7</w:t>
+          </w:r>
+        </w:p>
+        <w:p>
+          <w:pPr>
+            <w:pStyle w:val="TOC3"/>
+          </w:pPr>
+          <w:r>
+            <w:t>4.2.1 底层结构化 ingestion pipeline</w:t>
+          </w:r>
+          <w:r>
+            <w:tab/>
+          </w:r>
+          <w:r>
+            <w:t>7</w:t>
+          </w:r>
+        </w:p>
+        <w:p>
+          <w:pPr>
+            <w:pStyle w:val="TOC3"/>
+          </w:pPr>
+          <w:r>
+            <w:t>4.2.2 Entity-Relation-Chunk 异构证据图与混合检索</w:t>
+          </w:r>
+          <w:r>
+            <w:tab/>
+          </w:r>
+          <w:r>
+            <w:t>7</w:t>
+          </w:r>
+        </w:p>
+        <w:p>
+          <w:pPr>
+            <w:pStyle w:val="TOC3"/>
+          </w:pPr>
+          <w:r>
+            <w:t>4.2.3 kg-workbench 可视化与可解释问答工作台</w:t>
+          </w:r>
+          <w:r>
+            <w:tab/>
+          </w:r>
+          <w:r>
+            <w:t>8</w:t>
+          </w:r>
         </w:p>
         <w:p>
           <w:pPr>
             <w:pStyle w:val="TOC2"/>
-            <w:spacing w:line="360" w:lineRule="auto"/>
-            <w:rPr>
-              <w:rFonts w:asciiTheme="minorHAnsi" w:eastAsiaTheme="minorEastAsia" w:hAnsiTheme="minorHAnsi" w:cstheme="minorBidi"/>
-              <w:noProof/>
-              <w:kern w:val="2"/>
-              <w:sz w:val="22"/>
-              <w:szCs w:val="24"/>
-              <w14:ligatures w14:val="standardContextual"/>
-            </w:rPr>
           </w:pPr>
-          <w:hyperlink>
-            <w:r>
-              <w:rPr>
-                <w:rStyle w:val="aff0"/>
-                <w:noProof/>
-              </w:rPr>
-              <w:t xml:space="preserve">3.3 </w:t>
-            </w:r>
-            <w:r>
-              <w:rPr>
-                <w:rStyle w:val="aff0"/>
-                <w:noProof/>
-              </w:rPr>
-              <w:t>可解释问答与工作台化趋势</w:t>
-            </w:r>
-            <w:r>
-              <w:rPr>
-                <w:noProof/>
-              </w:rPr>
-              <w:tab/>
-              <w:t>5</w:t>
-            </w:r>
-          </w:hyperlink>
+          <w:r>
+            <w:t>4.3 4 月 17 日后的算法与架构补充</w:t>
+          </w:r>
+          <w:r>
+            <w:tab/>
+          </w:r>
+          <w:r>
+            <w:t>8</w:t>
+          </w:r>
+        </w:p>
+        <w:p>
+          <w:pPr>
+            <w:pStyle w:val="TOC3"/>
+          </w:pPr>
+          <w:r>
+            <w:t>4.3.1 版本化查询缓存与 SQLite 存储基线</w:t>
+          </w:r>
+          <w:r>
+            <w:tab/>
+          </w:r>
+          <w:r>
+            <w:t>8</w:t>
+          </w:r>
+        </w:p>
+        <w:p>
+          <w:pPr>
+            <w:pStyle w:val="TOC3"/>
+          </w:pPr>
+          <w:r>
+            <w:t>4.3.2 批量向量查询与关键词候选缓存</w:t>
+          </w:r>
+          <w:r>
+            <w:tab/>
+          </w:r>
+          <w:r>
+            <w:t>8</w:t>
+          </w:r>
+        </w:p>
+        <w:p>
+          <w:pPr>
+            <w:pStyle w:val="TOC3"/>
+          </w:pPr>
+          <w:r>
+            <w:t>4.3.3 无 LLM 关键词抽取与检索降级策略</w:t>
+          </w:r>
+          <w:r>
+            <w:tab/>
+          </w:r>
+          <w:r>
+            <w:t>9</w:t>
+          </w:r>
+        </w:p>
+        <w:p>
+          <w:pPr>
+            <w:pStyle w:val="TOC3"/>
+          </w:pPr>
+          <w:r>
+            <w:t>4.3.4 离线回放、断点续跑与多语料合并</w:t>
+          </w:r>
+          <w:r>
+            <w:tab/>
+          </w:r>
+          <w:r>
+            <w:t>9</w:t>
+          </w:r>
+        </w:p>
+        <w:p>
+          <w:pPr>
+            <w:pStyle w:val="TOC3"/>
+          </w:pPr>
+          <w:r>
+            <w:t>4.3.5 证据路径可迁移与解析健壮性</w:t>
+          </w:r>
+          <w:r>
+            <w:tab/>
+          </w:r>
+          <w:r>
+            <w:t>9</w:t>
+          </w:r>
         </w:p>
         <w:p>
           <w:pPr>
             <w:pStyle w:val="TOC1"/>
-            <w:tabs>
-              <w:tab w:val="left" w:pos="453"/>
-              <w:tab w:val="right" w:leader="dot" w:pos="9010"/>
-            </w:tabs>
-            <w:spacing w:line="360" w:lineRule="auto"/>
-            <w:rPr>
-              <w:rFonts w:asciiTheme="minorHAnsi" w:eastAsiaTheme="minorEastAsia" w:hAnsiTheme="minorHAnsi" w:cstheme="minorBidi"/>
-              <w:noProof/>
-              <w:kern w:val="2"/>
-              <w:sz w:val="22"/>
-              <w:szCs w:val="24"/>
-              <w14:ligatures w14:val="standardContextual"/>
-            </w:rPr>
           </w:pPr>
-          <w:hyperlink>
-            <w:r>
-              <w:rPr>
-                <w:rStyle w:val="aff0"/>
-                <w:noProof/>
-              </w:rPr>
-              <w:t xml:space="preserve">4 </w:t>
-            </w:r>
-            <w:r>
-              <w:rPr>
-                <w:rStyle w:val="aff0"/>
-                <w:noProof/>
-              </w:rPr>
-              <w:t>算法设计与实现</w:t>
-            </w:r>
-            <w:r>
-              <w:rPr>
-                <w:noProof/>
-              </w:rPr>
-              <w:tab/>
-              <w:t>6</w:t>
-            </w:r>
-          </w:hyperlink>
+          <w:r>
+            <w:tab/>
+          </w:r>
+          <w:r>
+            <w:tab/>
+          </w:r>
+          <w:r>
+            <w:t>5 实验结果及解读</w:t>
+          </w:r>
+          <w:r>
+            <w:tab/>
+          </w:r>
+          <w:r>
+            <w:t>10</w:t>
+          </w:r>
         </w:p>
         <w:p>
           <w:pPr>
             <w:pStyle w:val="TOC2"/>
-            <w:spacing w:line="360" w:lineRule="auto"/>
-            <w:rPr>
-              <w:rFonts w:asciiTheme="minorHAnsi" w:eastAsiaTheme="minorEastAsia" w:hAnsiTheme="minorHAnsi" w:cstheme="minorBidi"/>
-              <w:noProof/>
-              <w:kern w:val="2"/>
-              <w:sz w:val="22"/>
-              <w:szCs w:val="24"/>
-              <w14:ligatures w14:val="standardContextual"/>
-            </w:rPr>
           </w:pPr>
-          <w:hyperlink>
-            <w:r>
-              <w:rPr>
-                <w:rStyle w:val="aff0"/>
-                <w:noProof/>
-              </w:rPr>
-              <w:t xml:space="preserve">4.1 </w:t>
-            </w:r>
-            <w:r>
-              <w:rPr>
-                <w:rStyle w:val="aff0"/>
-                <w:noProof/>
-              </w:rPr>
-              <w:t>关键技术与创新</w:t>
-            </w:r>
-            <w:r>
-              <w:rPr>
-                <w:noProof/>
-              </w:rPr>
-              <w:tab/>
-              <w:t>6</w:t>
-            </w:r>
-          </w:hyperlink>
+          <w:r>
+            <w:t>5.1 实验条件与数据准备</w:t>
+          </w:r>
+          <w:r>
+            <w:tab/>
+          </w:r>
+          <w:r>
+            <w:t>10</w:t>
+          </w:r>
         </w:p>
         <w:p>
           <w:pPr>
             <w:pStyle w:val="TOC2"/>
-            <w:spacing w:line="360" w:lineRule="auto"/>
-            <w:rPr>
-              <w:rFonts w:asciiTheme="minorHAnsi" w:eastAsiaTheme="minorEastAsia" w:hAnsiTheme="minorHAnsi" w:cstheme="minorBidi"/>
-              <w:noProof/>
-              <w:kern w:val="2"/>
-              <w:sz w:val="22"/>
-              <w:szCs w:val="24"/>
-              <w14:ligatures w14:val="standardContextual"/>
-            </w:rPr>
           </w:pPr>
-          <w:hyperlink>
-            <w:r>
-              <w:rPr>
-                <w:rStyle w:val="aff0"/>
-                <w:noProof/>
-              </w:rPr>
-              <w:t xml:space="preserve">4.2 </w:t>
-            </w:r>
-            <w:r>
-              <w:rPr>
-                <w:rStyle w:val="aff0"/>
-                <w:noProof/>
-              </w:rPr>
-              <w:t>算法原理及技术实现</w:t>
-            </w:r>
-            <w:r>
-              <w:rPr>
-                <w:noProof/>
-              </w:rPr>
-              <w:tab/>
-              <w:t>6</w:t>
-            </w:r>
-          </w:hyperlink>
+          <w:r>
+            <w:t>5.2 测试数据</w:t>
+          </w:r>
+          <w:r>
+            <w:tab/>
+          </w:r>
+          <w:r>
+            <w:t>10</w:t>
+          </w:r>
         </w:p>
         <w:p>
           <w:pPr>
             <w:pStyle w:val="TOC3"/>
-            <w:spacing w:line="360" w:lineRule="auto"/>
-            <w:rPr>
-              <w:rFonts w:asciiTheme="minorHAnsi" w:eastAsiaTheme="minorEastAsia" w:hAnsiTheme="minorHAnsi" w:cstheme="minorBidi"/>
-              <w:noProof/>
-              <w:kern w:val="2"/>
-              <w:sz w:val="22"/>
-              <w:szCs w:val="24"/>
-              <w14:ligatures w14:val="standardContextual"/>
-            </w:rPr>
           </w:pPr>
-          <w:hyperlink>
-            <w:r>
-              <w:rPr>
-                <w:rStyle w:val="aff0"/>
-                <w:noProof/>
-              </w:rPr>
-              <w:t xml:space="preserve">4.2.1 </w:t>
-            </w:r>
-            <w:r>
-              <w:rPr>
-                <w:rStyle w:val="aff0"/>
-                <w:noProof/>
-              </w:rPr>
-              <w:t>底层结构化</w:t>
-            </w:r>
-            <w:r>
-              <w:rPr>
-                <w:rStyle w:val="aff0"/>
-                <w:noProof/>
-              </w:rPr>
-              <w:t xml:space="preserve"> ingestion pipeline</w:t>
-            </w:r>
-            <w:r>
-              <w:rPr>
-                <w:noProof/>
-              </w:rPr>
-              <w:tab/>
-              <w:t>6</w:t>
-            </w:r>
-          </w:hyperlink>
+          <w:r>
+            <w:t>5.2.1 代码与提交演进样本</w:t>
+          </w:r>
+          <w:r>
+            <w:tab/>
+          </w:r>
+          <w:r>
+            <w:t>10</w:t>
+          </w:r>
         </w:p>
         <w:p>
           <w:pPr>
             <w:pStyle w:val="TOC3"/>
-            <w:spacing w:line="360" w:lineRule="auto"/>
-            <w:rPr>
-              <w:rFonts w:asciiTheme="minorHAnsi" w:eastAsiaTheme="minorEastAsia" w:hAnsiTheme="minorHAnsi" w:cstheme="minorBidi"/>
-              <w:noProof/>
-              <w:kern w:val="2"/>
-              <w:sz w:val="22"/>
-              <w:szCs w:val="24"/>
-              <w14:ligatures w14:val="standardContextual"/>
-            </w:rPr>
           </w:pPr>
-          <w:hyperlink>
-            <w:r>
-              <w:rPr>
-                <w:rStyle w:val="aff0"/>
-                <w:noProof/>
-              </w:rPr>
-              <w:t xml:space="preserve">4.2.2 Entity-Relation-Chunk </w:t>
-            </w:r>
-            <w:r>
-              <w:rPr>
-                <w:rStyle w:val="aff0"/>
-                <w:noProof/>
-              </w:rPr>
-              <w:t>异构证据图与混合检索</w:t>
-            </w:r>
-            <w:r>
-              <w:rPr>
-                <w:noProof/>
-              </w:rPr>
-              <w:tab/>
-              <w:t>6</w:t>
-            </w:r>
-          </w:hyperlink>
+          <w:r>
+            <w:t>5.2.2 benchmark、trace 与样例项目</w:t>
+          </w:r>
+          <w:r>
+            <w:tab/>
+          </w:r>
+          <w:r>
+            <w:t>10</w:t>
+          </w:r>
         </w:p>
         <w:p>
           <w:pPr>
             <w:pStyle w:val="TOC3"/>
-            <w:spacing w:line="360" w:lineRule="auto"/>
-            <w:rPr>
-              <w:rFonts w:asciiTheme="minorHAnsi" w:eastAsiaTheme="minorEastAsia" w:hAnsiTheme="minorHAnsi" w:cstheme="minorBidi"/>
-              <w:noProof/>
-              <w:kern w:val="2"/>
-              <w:sz w:val="22"/>
-              <w:szCs w:val="24"/>
-              <w14:ligatures w14:val="standardContextual"/>
-            </w:rPr>
           </w:pPr>
-          <w:hyperlink>
-            <w:r>
-              <w:rPr>
-                <w:rStyle w:val="aff0"/>
-                <w:noProof/>
-              </w:rPr>
-              <w:t xml:space="preserve">4.2.3 kg-workbench </w:t>
-            </w:r>
-            <w:r>
-              <w:rPr>
-                <w:rStyle w:val="aff0"/>
-                <w:noProof/>
-              </w:rPr>
-              <w:t>可视化与可解释问答工作台</w:t>
-            </w:r>
-            <w:r>
-              <w:rPr>
-                <w:noProof/>
-              </w:rPr>
-              <w:tab/>
-              <w:t>6</w:t>
-            </w:r>
-          </w:hyperlink>
+          <w:r>
+            <w:t>5.2.3 工作台截图与交互效果</w:t>
+          </w:r>
+          <w:r>
+            <w:tab/>
+          </w:r>
+          <w:r>
+            <w:t>11</w:t>
+          </w:r>
+        </w:p>
+        <w:p>
+          <w:pPr>
+            <w:pStyle w:val="TOC2"/>
+          </w:pPr>
+          <w:r>
+            <w:t>5.3 测试步骤及结果</w:t>
+          </w:r>
+          <w:r>
+            <w:tab/>
+          </w:r>
+          <w:r>
+            <w:t>14</w:t>
+          </w:r>
+        </w:p>
+        <w:p>
+          <w:pPr>
+            <w:pStyle w:val="TOC3"/>
+          </w:pPr>
+          <w:r>
+            <w:t>5.3.1 代码验证结果</w:t>
+          </w:r>
+          <w:r>
+            <w:tab/>
+          </w:r>
+          <w:r>
+            <w:t>14</w:t>
+          </w:r>
+        </w:p>
+        <w:p>
+          <w:pPr>
+            <w:pStyle w:val="TOC3"/>
+          </w:pPr>
+          <w:r>
+            <w:t>5.3.2 结构化检索与问答效果分析</w:t>
+          </w:r>
+          <w:r>
+            <w:tab/>
+          </w:r>
+          <w:r>
+            <w:t>14</w:t>
+          </w:r>
+        </w:p>
+        <w:p>
+          <w:pPr>
+            <w:pStyle w:val="TOC3"/>
+          </w:pPr>
+          <w:r>
+            <w:t>5.3.3 工作台联动展示效果</w:t>
+          </w:r>
+          <w:r>
+            <w:tab/>
+          </w:r>
+          <w:r>
+            <w:t>14</w:t>
+          </w:r>
+        </w:p>
+        <w:p>
+          <w:pPr>
+            <w:pStyle w:val="TOC3"/>
+          </w:pPr>
+          <w:r>
+            <w:t>5.3.4 构图输入文档说明</w:t>
+          </w:r>
+          <w:r>
+            <w:tab/>
+          </w:r>
+          <w:r>
+            <w:t>15</w:t>
+          </w:r>
+        </w:p>
+        <w:p>
+          <w:pPr>
+            <w:pStyle w:val="TOC3"/>
+          </w:pPr>
+          <w:r>
+            <w:t>5.3.5 demo_diet_kg 图谱产物分析</w:t>
+          </w:r>
+          <w:r>
+            <w:tab/>
+          </w:r>
+          <w:r>
+            <w:t>15</w:t>
+          </w:r>
+        </w:p>
+        <w:p>
+          <w:pPr>
+            <w:pStyle w:val="TOC3"/>
+          </w:pPr>
+          <w:r>
+            <w:t>5.3.6 q7 检索推理样例对比</w:t>
+          </w:r>
+          <w:r>
+            <w:tab/>
+          </w:r>
+          <w:r>
+            <w:t>16</w:t>
+          </w:r>
+        </w:p>
+        <w:p>
+          <w:pPr>
+            <w:pStyle w:val="TOC2"/>
+          </w:pPr>
+          <w:r>
+            <w:t>5.4 结论</w:t>
+          </w:r>
+          <w:r>
+            <w:tab/>
+          </w:r>
+          <w:r>
+            <w:t>17</w:t>
+          </w:r>
         </w:p>
         <w:p>
           <w:pPr>
             <w:pStyle w:val="TOC1"/>
-            <w:tabs>
-              <w:tab w:val="left" w:pos="453"/>
-              <w:tab w:val="right" w:leader="dot" w:pos="9010"/>
-            </w:tabs>
-            <w:spacing w:line="360" w:lineRule="auto"/>
-            <w:rPr>
-              <w:rFonts w:asciiTheme="minorHAnsi" w:eastAsiaTheme="minorEastAsia" w:hAnsiTheme="minorHAnsi" w:cstheme="minorBidi"/>
-              <w:noProof/>
-              <w:kern w:val="2"/>
-              <w:sz w:val="22"/>
-              <w:szCs w:val="24"/>
-              <w14:ligatures w14:val="standardContextual"/>
-            </w:rPr>
           </w:pPr>
-          <w:hyperlink>
-            <w:r>
-              <w:rPr>
-                <w:rStyle w:val="aff0"/>
-                <w:noProof/>
-              </w:rPr>
-              <w:t xml:space="preserve">5 </w:t>
-            </w:r>
-            <w:r>
-              <w:rPr>
-                <w:rStyle w:val="aff0"/>
-                <w:noProof/>
-              </w:rPr>
-              <w:t>实验结果及解读</w:t>
-            </w:r>
-            <w:r>
-              <w:rPr>
-                <w:noProof/>
-              </w:rPr>
-              <w:tab/>
-              <w:t>7</w:t>
-            </w:r>
-          </w:hyperlink>
+          <w:r>
+            <w:tab/>
+          </w:r>
+          <w:r>
+            <w:tab/>
+          </w:r>
+          <w:r>
+            <w:t>6 附录</w:t>
+          </w:r>
+          <w:r>
+            <w:tab/>
+          </w:r>
+          <w:r>
+            <w:t>17</w:t>
+          </w:r>
         </w:p>
         <w:p>
           <w:pPr>
             <w:pStyle w:val="TOC2"/>
-            <w:spacing w:line="360" w:lineRule="auto"/>
-            <w:rPr>
-              <w:rFonts w:asciiTheme="minorHAnsi" w:eastAsiaTheme="minorEastAsia" w:hAnsiTheme="minorHAnsi" w:cstheme="minorBidi"/>
-              <w:noProof/>
-              <w:kern w:val="2"/>
-              <w:sz w:val="22"/>
-              <w:szCs w:val="24"/>
-              <w14:ligatures w14:val="standardContextual"/>
-            </w:rPr>
           </w:pPr>
-          <w:hyperlink>
-            <w:r>
-              <w:rPr>
-                <w:rStyle w:val="aff0"/>
-                <w:noProof/>
-              </w:rPr>
-              <w:t xml:space="preserve">5.1 </w:t>
-            </w:r>
-            <w:r>
-              <w:rPr>
-                <w:rStyle w:val="aff0"/>
-                <w:noProof/>
-              </w:rPr>
-              <w:t>实验条件与数据准备</w:t>
-            </w:r>
-            <w:r>
-              <w:rPr>
-                <w:noProof/>
-              </w:rPr>
-              <w:tab/>
-              <w:t>7</w:t>
-            </w:r>
-          </w:hyperlink>
-        </w:p>
-        <w:p>
-          <w:pPr>
-            <w:pStyle w:val="TOC2"/>
-            <w:spacing w:line="360" w:lineRule="auto"/>
-            <w:rPr>
-              <w:rFonts w:asciiTheme="minorHAnsi" w:eastAsiaTheme="minorEastAsia" w:hAnsiTheme="minorHAnsi" w:cstheme="minorBidi"/>
-              <w:noProof/>
-              <w:kern w:val="2"/>
-              <w:sz w:val="22"/>
-              <w:szCs w:val="24"/>
-              <w14:ligatures w14:val="standardContextual"/>
-            </w:rPr>
-          </w:pPr>
-          <w:hyperlink>
-            <w:r>
-              <w:rPr>
-                <w:rStyle w:val="aff0"/>
-                <w:noProof/>
-              </w:rPr>
-              <w:t xml:space="preserve">5.2 </w:t>
-            </w:r>
-            <w:r>
-              <w:rPr>
-                <w:rStyle w:val="aff0"/>
-                <w:noProof/>
-              </w:rPr>
-              <w:t>测试数据</w:t>
-            </w:r>
-            <w:r>
-              <w:rPr>
-                <w:noProof/>
-              </w:rPr>
-              <w:tab/>
-              <w:t>7</w:t>
-            </w:r>
-          </w:hyperlink>
+          <w:r>
+            <w:t>6.1 关键模块与证据清单</w:t>
+          </w:r>
+          <w:r>
+            <w:tab/>
+          </w:r>
+          <w:r>
+            <w:t>17</w:t>
+          </w:r>
         </w:p>
         <w:p>
           <w:pPr>
             <w:pStyle w:val="TOC3"/>
-            <w:spacing w:line="360" w:lineRule="auto"/>
-            <w:rPr>
-              <w:rFonts w:asciiTheme="minorHAnsi" w:eastAsiaTheme="minorEastAsia" w:hAnsiTheme="minorHAnsi" w:cstheme="minorBidi"/>
-              <w:noProof/>
-              <w:kern w:val="2"/>
-              <w:sz w:val="22"/>
-              <w:szCs w:val="24"/>
-              <w14:ligatures w14:val="standardContextual"/>
-            </w:rPr>
           </w:pPr>
-          <w:hyperlink>
-            <w:r>
-              <w:rPr>
-                <w:rStyle w:val="aff0"/>
-                <w:noProof/>
-              </w:rPr>
-              <w:t xml:space="preserve">5.2.1 </w:t>
-            </w:r>
-            <w:r>
-              <w:rPr>
-                <w:rStyle w:val="aff0"/>
-                <w:noProof/>
-              </w:rPr>
-              <w:t>代码与提交演进样本</w:t>
-            </w:r>
-            <w:r>
-              <w:rPr>
-                <w:noProof/>
-              </w:rPr>
-              <w:tab/>
-              <w:t>7</w:t>
-            </w:r>
-          </w:hyperlink>
-        </w:p>
-        <w:p>
-          <w:pPr>
-            <w:pStyle w:val="TOC3"/>
-            <w:spacing w:line="360" w:lineRule="auto"/>
-            <w:rPr>
-              <w:rFonts w:asciiTheme="minorHAnsi" w:eastAsiaTheme="minorEastAsia" w:hAnsiTheme="minorHAnsi" w:cstheme="minorBidi"/>
-              <w:noProof/>
-              <w:kern w:val="2"/>
-              <w:sz w:val="22"/>
-              <w:szCs w:val="24"/>
-              <w14:ligatures w14:val="standardContextual"/>
-            </w:rPr>
-          </w:pPr>
-          <w:hyperlink>
-            <w:r>
-              <w:rPr>
-                <w:rStyle w:val="aff0"/>
-                <w:noProof/>
-              </w:rPr>
-              <w:t>5.2.2 benchmark</w:t>
-            </w:r>
-            <w:r>
-              <w:rPr>
-                <w:rStyle w:val="aff0"/>
-                <w:noProof/>
-              </w:rPr>
-              <w:t>、</w:t>
-            </w:r>
-            <w:r>
-              <w:rPr>
-                <w:rStyle w:val="aff0"/>
-                <w:noProof/>
-              </w:rPr>
-              <w:t xml:space="preserve">trace </w:t>
-            </w:r>
-            <w:r>
-              <w:rPr>
-                <w:rStyle w:val="aff0"/>
-                <w:noProof/>
-              </w:rPr>
-              <w:t>与样例项目</w:t>
-            </w:r>
-            <w:r>
-              <w:rPr>
-                <w:noProof/>
-              </w:rPr>
-              <w:tab/>
-              <w:t>7</w:t>
-            </w:r>
-          </w:hyperlink>
-        </w:p>
-        <w:p>
-          <w:pPr>
-            <w:pStyle w:val="TOC3"/>
-            <w:spacing w:line="360" w:lineRule="auto"/>
-            <w:rPr>
-              <w:rFonts w:asciiTheme="minorHAnsi" w:eastAsiaTheme="minorEastAsia" w:hAnsiTheme="minorHAnsi" w:cstheme="minorBidi"/>
-              <w:noProof/>
-              <w:kern w:val="2"/>
-              <w:sz w:val="22"/>
-              <w:szCs w:val="24"/>
-              <w14:ligatures w14:val="standardContextual"/>
-            </w:rPr>
-          </w:pPr>
-          <w:hyperlink>
-            <w:r>
-              <w:rPr>
-                <w:rStyle w:val="aff0"/>
-                <w:noProof/>
-              </w:rPr>
-              <w:t xml:space="preserve">5.2.3 </w:t>
-            </w:r>
-            <w:r>
-              <w:rPr>
-                <w:rStyle w:val="aff0"/>
-                <w:noProof/>
-              </w:rPr>
-              <w:t>工作台截图与交互效果</w:t>
-            </w:r>
-            <w:r>
-              <w:rPr>
-                <w:noProof/>
-              </w:rPr>
-              <w:tab/>
-              <w:t>8</w:t>
-            </w:r>
-          </w:hyperlink>
-        </w:p>
-        <w:p>
-          <w:pPr>
-            <w:pStyle w:val="TOC2"/>
-            <w:spacing w:line="360" w:lineRule="auto"/>
-            <w:rPr>
-              <w:rFonts w:asciiTheme="minorHAnsi" w:eastAsiaTheme="minorEastAsia" w:hAnsiTheme="minorHAnsi" w:cstheme="minorBidi"/>
-              <w:noProof/>
-              <w:kern w:val="2"/>
-              <w:sz w:val="22"/>
-              <w:szCs w:val="24"/>
-              <w14:ligatures w14:val="standardContextual"/>
-            </w:rPr>
-          </w:pPr>
-          <w:hyperlink>
-            <w:r>
-              <w:rPr>
-                <w:rStyle w:val="aff0"/>
-                <w:noProof/>
-              </w:rPr>
-              <w:t xml:space="preserve">5.3 </w:t>
-            </w:r>
-            <w:r>
-              <w:rPr>
-                <w:rStyle w:val="aff0"/>
-                <w:noProof/>
-              </w:rPr>
-              <w:t>测试步骤及结果</w:t>
-            </w:r>
-            <w:r>
-              <w:rPr>
-                <w:noProof/>
-              </w:rPr>
-              <w:tab/>
-              <w:t>11</w:t>
-            </w:r>
-          </w:hyperlink>
-        </w:p>
-        <w:p>
-          <w:pPr>
-            <w:pStyle w:val="TOC3"/>
-            <w:spacing w:line="360" w:lineRule="auto"/>
-            <w:rPr>
-              <w:rFonts w:asciiTheme="minorHAnsi" w:eastAsiaTheme="minorEastAsia" w:hAnsiTheme="minorHAnsi" w:cstheme="minorBidi"/>
-              <w:noProof/>
-              <w:kern w:val="2"/>
-              <w:sz w:val="22"/>
-              <w:szCs w:val="24"/>
-              <w14:ligatures w14:val="standardContextual"/>
-            </w:rPr>
-          </w:pPr>
-          <w:hyperlink>
-            <w:r>
-              <w:rPr>
-                <w:rStyle w:val="aff0"/>
-                <w:noProof/>
-              </w:rPr>
-              <w:t xml:space="preserve">5.3.1 </w:t>
-            </w:r>
-            <w:r>
-              <w:rPr>
-                <w:rStyle w:val="aff0"/>
-                <w:noProof/>
-              </w:rPr>
-              <w:t>代码验证结果</w:t>
-            </w:r>
-            <w:r>
-              <w:rPr>
-                <w:noProof/>
-              </w:rPr>
-              <w:tab/>
-              <w:t>11</w:t>
-            </w:r>
-          </w:hyperlink>
-        </w:p>
-        <w:p>
-          <w:pPr>
-            <w:pStyle w:val="TOC3"/>
-            <w:spacing w:line="360" w:lineRule="auto"/>
-            <w:rPr>
-              <w:rFonts w:asciiTheme="minorHAnsi" w:eastAsiaTheme="minorEastAsia" w:hAnsiTheme="minorHAnsi" w:cstheme="minorBidi"/>
-              <w:noProof/>
-              <w:kern w:val="2"/>
-              <w:sz w:val="22"/>
-              <w:szCs w:val="24"/>
-              <w14:ligatures w14:val="standardContextual"/>
-            </w:rPr>
-          </w:pPr>
-          <w:hyperlink>
-            <w:r>
-              <w:rPr>
-                <w:rStyle w:val="aff0"/>
-                <w:noProof/>
-              </w:rPr>
-              <w:t xml:space="preserve">5.3.2 </w:t>
-            </w:r>
-            <w:r>
-              <w:rPr>
-                <w:rStyle w:val="aff0"/>
-                <w:noProof/>
-              </w:rPr>
-              <w:t>结构化检索与问答效果分析</w:t>
-            </w:r>
-            <w:r>
-              <w:rPr>
-                <w:noProof/>
-              </w:rPr>
-              <w:tab/>
-              <w:t>11</w:t>
-            </w:r>
-          </w:hyperlink>
-        </w:p>
-        <w:p>
-          <w:pPr>
-            <w:pStyle w:val="TOC3"/>
-            <w:spacing w:line="360" w:lineRule="auto"/>
-            <w:rPr>
-              <w:rFonts w:asciiTheme="minorHAnsi" w:eastAsiaTheme="minorEastAsia" w:hAnsiTheme="minorHAnsi" w:cstheme="minorBidi"/>
-              <w:noProof/>
-              <w:kern w:val="2"/>
-              <w:sz w:val="22"/>
-              <w:szCs w:val="24"/>
-              <w14:ligatures w14:val="standardContextual"/>
-            </w:rPr>
-          </w:pPr>
-          <w:hyperlink>
-            <w:r>
-              <w:rPr>
-                <w:rStyle w:val="aff0"/>
-                <w:noProof/>
-              </w:rPr>
-              <w:t xml:space="preserve">5.3.3 </w:t>
-            </w:r>
-            <w:r>
-              <w:rPr>
-                <w:rStyle w:val="aff0"/>
-                <w:noProof/>
-              </w:rPr>
-              <w:t>工作台联动展示效果</w:t>
-            </w:r>
-            <w:r>
-              <w:rPr>
-                <w:noProof/>
-              </w:rPr>
-              <w:tab/>
-              <w:t>11</w:t>
-            </w:r>
-          </w:hyperlink>
-        </w:p>
-        <w:p>
-          <w:pPr>
-            <w:pStyle w:val="TOC2"/>
-            <w:spacing w:line="360" w:lineRule="auto"/>
-            <w:rPr>
-              <w:rFonts w:asciiTheme="minorHAnsi" w:eastAsiaTheme="minorEastAsia" w:hAnsiTheme="minorHAnsi" w:cstheme="minorBidi"/>
-              <w:noProof/>
-              <w:kern w:val="2"/>
-              <w:sz w:val="22"/>
-              <w:szCs w:val="24"/>
-              <w14:ligatures w14:val="standardContextual"/>
-            </w:rPr>
-          </w:pPr>
-          <w:hyperlink>
-            <w:r>
-              <w:rPr>
-                <w:rStyle w:val="aff0"/>
-                <w:noProof/>
-              </w:rPr>
-              <w:t xml:space="preserve">5.4 </w:t>
-            </w:r>
-            <w:r>
-              <w:rPr>
-                <w:rStyle w:val="aff0"/>
-                <w:noProof/>
-              </w:rPr>
-              <w:t>结论</w:t>
-            </w:r>
-            <w:r>
-              <w:rPr>
-                <w:noProof/>
-              </w:rPr>
-              <w:tab/>
-              <w:t>11</w:t>
-            </w:r>
-          </w:hyperlink>
-        </w:p>
-        <w:p>
-          <w:pPr>
-            <w:pStyle w:val="TOC1"/>
-            <w:tabs>
-              <w:tab w:val="left" w:pos="453"/>
-              <w:tab w:val="right" w:leader="dot" w:pos="9010"/>
-            </w:tabs>
-            <w:spacing w:line="360" w:lineRule="auto"/>
-            <w:rPr>
-              <w:rFonts w:asciiTheme="minorHAnsi" w:eastAsiaTheme="minorEastAsia" w:hAnsiTheme="minorHAnsi" w:cstheme="minorBidi"/>
-              <w:noProof/>
-              <w:kern w:val="2"/>
-              <w:sz w:val="22"/>
-              <w:szCs w:val="24"/>
-              <w14:ligatures w14:val="standardContextual"/>
-            </w:rPr>
-          </w:pPr>
-          <w:hyperlink>
-            <w:r>
-              <w:rPr>
-                <w:rStyle w:val="aff0"/>
-                <w:noProof/>
-              </w:rPr>
-              <w:t xml:space="preserve">6 </w:t>
-            </w:r>
-            <w:r>
-              <w:rPr>
-                <w:rStyle w:val="aff0"/>
-                <w:noProof/>
-              </w:rPr>
-              <w:t>引用</w:t>
-            </w:r>
-            <w:r>
-              <w:rPr>
-                <w:noProof/>
-              </w:rPr>
-              <w:tab/>
-              <w:t>12</w:t>
-            </w:r>
-          </w:hyperlink>
-        </w:p>
-        <w:p>
-          <w:pPr>
-            <w:pStyle w:val="TOC1"/>
-            <w:tabs>
-              <w:tab w:val="left" w:pos="453"/>
-              <w:tab w:val="right" w:leader="dot" w:pos="9010"/>
-            </w:tabs>
-            <w:spacing w:line="360" w:lineRule="auto"/>
-            <w:rPr>
-              <w:rFonts w:asciiTheme="minorHAnsi" w:eastAsiaTheme="minorEastAsia" w:hAnsiTheme="minorHAnsi" w:cstheme="minorBidi"/>
-              <w:noProof/>
-              <w:kern w:val="2"/>
-              <w:sz w:val="22"/>
-              <w:szCs w:val="24"/>
-              <w14:ligatures w14:val="standardContextual"/>
-            </w:rPr>
-          </w:pPr>
-          <w:hyperlink>
-            <w:r>
-              <w:rPr>
-                <w:rStyle w:val="aff0"/>
-                <w:noProof/>
-              </w:rPr>
-              <w:t xml:space="preserve">7 </w:t>
-            </w:r>
-            <w:r>
-              <w:rPr>
-                <w:rStyle w:val="aff0"/>
-                <w:noProof/>
-              </w:rPr>
-              <w:t>附录</w:t>
-            </w:r>
-            <w:r>
-              <w:rPr>
-                <w:noProof/>
-              </w:rPr>
-              <w:tab/>
-              <w:t>12</w:t>
-            </w:r>
-          </w:hyperlink>
-        </w:p>
-        <w:p>
-          <w:pPr>
-            <w:pStyle w:val="TOC2"/>
-            <w:spacing w:line="360" w:lineRule="auto"/>
-            <w:rPr>
-              <w:rFonts w:asciiTheme="minorHAnsi" w:eastAsiaTheme="minorEastAsia" w:hAnsiTheme="minorHAnsi" w:cstheme="minorBidi"/>
-              <w:noProof/>
-              <w:kern w:val="2"/>
-              <w:sz w:val="22"/>
-              <w:szCs w:val="24"/>
-              <w14:ligatures w14:val="standardContextual"/>
-            </w:rPr>
-          </w:pPr>
-          <w:hyperlink>
-            <w:r>
-              <w:rPr>
-                <w:rStyle w:val="aff0"/>
-                <w:noProof/>
-              </w:rPr>
-              <w:t xml:space="preserve">7.1 </w:t>
-            </w:r>
-            <w:r>
-              <w:rPr>
-                <w:rStyle w:val="aff0"/>
-                <w:noProof/>
-              </w:rPr>
-              <w:t>关键模块与证据清单</w:t>
-            </w:r>
-            <w:r>
-              <w:rPr>
-                <w:noProof/>
-              </w:rPr>
-              <w:tab/>
-              <w:t>12</w:t>
-            </w:r>
-          </w:hyperlink>
-        </w:p>
-        <w:p>
-          <w:pPr>
-            <w:pStyle w:val="TOC3"/>
-            <w:spacing w:line="360" w:lineRule="auto"/>
-            <w:rPr>
-              <w:rFonts w:asciiTheme="minorHAnsi" w:eastAsiaTheme="minorEastAsia" w:hAnsiTheme="minorHAnsi" w:cstheme="minorBidi"/>
-              <w:noProof/>
-              <w:kern w:val="2"/>
-              <w:sz w:val="22"/>
-              <w:szCs w:val="24"/>
-              <w14:ligatures w14:val="standardContextual"/>
-            </w:rPr>
-          </w:pPr>
-          <w:hyperlink>
-            <w:r>
-              <w:rPr>
-                <w:rStyle w:val="aff0"/>
-                <w:noProof/>
-              </w:rPr>
-              <w:t xml:space="preserve">7.1.1 </w:t>
-            </w:r>
-            <w:r>
-              <w:rPr>
-                <w:rStyle w:val="aff0"/>
-                <w:noProof/>
-              </w:rPr>
-              <w:t>关键代码、命令与输出文件</w:t>
-            </w:r>
-            <w:r>
-              <w:rPr>
-                <w:noProof/>
-              </w:rPr>
-              <w:tab/>
-              <w:t>12</w:t>
-            </w:r>
-          </w:hyperlink>
-        </w:p>
-        <w:p>
-          <w:pPr>
-            <w:spacing w:line="360" w:lineRule="auto"/>
-            <w:rPr>
-              <w:rFonts w:ascii="Times New Roman" w:eastAsia="宋体" w:hAnsi="Times New Roman" w:cs="Times New Roman"/>
-            </w:rPr>
-          </w:pPr>
+          <w:r>
+            <w:t>6.1.1 关键代码、命令与输出文件</w:t>
+          </w:r>
+          <w:r>
+            <w:tab/>
+          </w:r>
+          <w:r>
+            <w:t>17</w:t>
+          </w:r>
         </w:p>
       </w:sdtContent>
     </w:sdt>
@@ -1585,7 +814,13 @@
         </w:rPr>
       </w:pPr>
       <w:r>
-        <w:t>表格 1 ragent 与 kg-workbench 的关键结构升级 5</w:t>
+        <w:t>表格 1 ragent 与 kg-workbench 的关键结构升级</w:t>
+      </w:r>
+      <w:r>
+        <w:tab/>
+      </w:r>
+      <w:r>
+        <w:t>6</w:t>
       </w:r>
     </w:p>
     <w:p>
@@ -1604,7 +839,13 @@
         </w:rPr>
       </w:pPr>
       <w:r>
-        <w:t>表格 2 代码验证、benchmark 与 trace 实证摘要 10</w:t>
+        <w:t>表格 2 代码验证、benchmark 与 trace 实证摘要</w:t>
+      </w:r>
+      <w:r>
+        <w:tab/>
+      </w:r>
+      <w:r>
+        <w:t>13</w:t>
       </w:r>
     </w:p>
     <w:p>
@@ -1673,11 +914,25 @@
         </w:rPr>
       </w:pPr>
       <w:r>
-        <w:t>图 1 kg-workbench 全局图谱与问答工作台主界面 9</w:t>
+        <w:t>图 1 kg-workbench 全局图谱与问答工作台主界面</w:t>
+      </w:r>
+      <w:r>
+        <w:tab/>
+      </w:r>
+      <w:r>
+        <w:t>12</w:t>
       </w:r>
       <w:r>
         <w:br/>
-        <w:t>图 2 kg-workbench 图谱、证据面板与推理链路联动界面 10</w:t>
+      </w:r>
+      <w:r>
+        <w:t>图 2 kg-workbench 图谱、证据面板与推理链路联动界面</w:t>
+      </w:r>
+      <w:r>
+        <w:tab/>
+      </w:r>
+      <w:r>
+        <w:t>13</w:t>
       </w:r>
     </w:p>
     <w:p>
@@ -3011,20 +2266,7 @@
         <w:spacing w:line="360" w:lineRule="auto"/>
       </w:pPr>
       <w:r>
-        <w:lastRenderedPageBreak/>
-        <w:t>表格</w:t>
-      </w:r>
-      <w:r>
-        <w:t xml:space="preserve"> 1 ragent </w:t>
-      </w:r>
-      <w:r>
-        <w:t>与</w:t>
-      </w:r>
-      <w:r>
-        <w:t xml:space="preserve"> kg-workbench </w:t>
-      </w:r>
-      <w:r>
-        <w:t>的关键结构升级</w:t>
+        <w:t>表格 1 ragent 与 kg-workbench 的关键结构升级</w:t>
       </w:r>
     </w:p>
     <w:tbl>
@@ -4521,6 +3763,120 @@
     </w:p>
     <w:p>
       <w:pPr>
+        <w:pStyle w:val="2"/>
+      </w:pPr>
+      <w:r>
+        <w:t>4 月 17 日后的算法与架构补充</w:t>
+      </w:r>
+    </w:p>
+    <w:p>
+      <w:pPr/>
+      <w:r>
+        <w:t>4 月 17 日之后，ragent 的更新重点已经从单点功能扩展转向查询链路可复用、检索策略可降级、构图流程可回放以及多语料项目可合并。以下仅保留代码算法、数据结构和通用架构层面的变化；与 MEP 平台打包、组件部署、Ascend/vLLM、上传包和离线 wheelhouse 相关的工程适配不纳入本节。</w:t>
+      </w:r>
+    </w:p>
+    <w:p>
+      <w:pPr>
+        <w:pStyle w:val="3"/>
+      </w:pPr>
+      <w:r>
+        <w:t>版本化查询缓存与 SQLite 存储基线</w:t>
+      </w:r>
+    </w:p>
+    <w:p>
+      <w:pPr/>
+      <w:r>
+        <w:t>查询层新增了分层缓存架构，把一次问答拆成关键词、检索、上下文渲染、Prompt 渲染和最终答案等可独立复用的阶段。缓存指纹不再只依赖 query 文本，而是同时纳入 mode、QueryParam、模型标识、rerank 配置、tokenizer 标识、corpus_revision 和 index_digest 等因素；当插入、删除、离线回放或图谱合并改变语料时，Ragent 会提升 corpus_revision，使旧缓存自然失效，避免“命中旧答案但底层语料已变”的问题。</w:t>
+      </w:r>
+    </w:p>
+    <w:p>
+      <w:pPr/>
+      <w:r>
+        <w:t>存储侧从 JSON KV 过渡到 SQLiteKVStorage，并为查询缓存单独引入 SQLiteQueryCacheStorage。SQLite 方案使用 WAL、索引化的 mode/cache_type/revision 字段、TTL、LRU 裁剪和按 cache_type 精确清理能力，既保留 entity extraction 等长期 LLM cache，又把 graph/hybrid 查询缓存作为可回收的运行时加速层。benchmarking 模块还加入了损坏 cache DB 的隔离和重建逻辑，使缓存文件出错时可以恢复为空缓存，而不是影响主查询路径。</w:t>
+      </w:r>
+    </w:p>
+    <w:p>
+      <w:pPr>
+        <w:pStyle w:val="3"/>
+      </w:pPr>
+      <w:r>
+        <w:t>批量向量查询与关键词候选缓存</w:t>
+      </w:r>
+    </w:p>
+    <w:p>
+      <w:pPr/>
+      <w:r>
+        <w:t>检索性能策略也发生了结构性变化。BaseVectorStorage 新增 query_many 和 query_many_by_embeddings 接口，FAISS、Milvus、NanoVectorDB 后端都支持多 query 一次性 embedding 和批量 index search。operate.py 中的 diversified retrieval 因此可以对完整 query、低层关键词和高层关键词的多个变体进行批量召回，再用 RRF 分数、matched_query_variants 和 query_variant_hit_count 合并结果，同时保留每个变体至少命中一个候选的覆盖策略。</w:t>
+      </w:r>
+    </w:p>
+    <w:p>
+      <w:pPr/>
+      <w:r>
+        <w:t>5 月 25 日新增的 keyword_candidate 缓存进一步把“关键词变体 -&gt; 向量候选”固化为可复用单元。它支持按 normalized keyword、vector storage、ids、top_k、corpus_revision 和关键词策略构建指纹，并提供 read/write 开关、独立 top_k、TTL 与最大条数限制。现有 keyword cache benchmark 显示，在 graph 检索的 3 个问题样本中，warm 阶段平均 wall time 从约 3.90s 降至 0.56s，下降约 85.66%；hybrid 样本从约 6.01s 降至 5.35s，下降约 10.94%。该 benchmark 使用 only_need_context 和显式关键词，主要验证候选缓存收益，不把最终答案 LLM 的生成耗时混入结论。</w:t>
+      </w:r>
+    </w:p>
+    <w:p>
+      <w:pPr>
+        <w:pStyle w:val="3"/>
+      </w:pPr>
+      <w:r>
+        <w:t>无 LLM 关键词抽取与检索降级策略</w:t>
+      </w:r>
+    </w:p>
+    <w:p>
+      <w:pPr/>
+      <w:r>
+        <w:t>关键词策略从“默认依赖 LLM 抽取”扩展为可显式降级的多源解析。QueryParam 增加 allow_llm_keyword_extraction、keyword_source、keyword_strategy、keyword_model、keyword_model_error 等字段；当 retrieval-only 或 only_need_context 场景不应调用 LLM 时，系统会通过 GLiNER token classification fallback 抽取高层/低层关键词，并把模型、设备和失败原因写入 trace 与缓存指纹。GLiNER 不可用时，系统也不会隐式回退到 LLM，而是返回带原因的空关键词结果，保证检索-only 场景的调用边界可控。</w:t>
+      </w:r>
+    </w:p>
+    <w:p>
+      <w:pPr/>
+      <w:r>
+        <w:t>针对中文短问句和泛化问题，keyword_extraction.py 增加了本地 CJK 切词、GLiNER words splitter patch、langdetect stub 和 token candidate fallback；operate.py 则在 query-only fallback 为空时，从首轮向量证据的文件名、source_ref、section_path、标题和首行文本中反推信息量更高的关键词。与此同时，5 月 12 日的关键词后处理调整保留了部分 generic keywords，避免把“指南、标准、肥胖食养、能量消耗”这类看似泛化但对专业语料定位很关键的词过早过滤掉。</w:t>
+      </w:r>
+    </w:p>
+    <w:p>
+      <w:pPr>
+        <w:pStyle w:val="3"/>
+      </w:pPr>
+      <w:r>
+        <w:t>离线回放、断点续跑与多语料合并</w:t>
+      </w:r>
+    </w:p>
+    <w:p>
+      <w:pPr/>
+      <w:r>
+        <w:t>构图架构新增 RawMergeUnit 作为可序列化中间层，把文档内容、chunk、vector chunk、实体/关系抽取结果、source_group_key 和 metadata 封装成 JSONL。tools/export_raw_merge_units.py 可先批量导出抽取单元，支持 resume、失败记录、进度 JSONL 和成功记录；ragent/offline_replay.py 再按 source_group_key 分组回放，写入 full_docs、text_chunks、chunks_vdb、doc_status，并调用与在线入库相同的 merge_nodes_and_edges 完成最终图谱合并。</w:t>
+      </w:r>
+    </w:p>
+    <w:p>
+      <w:pPr/>
+      <w:r>
+        <w:t>这个拆分使“抽取”和“最终合图”解耦：大规模语料可以先分片抽取、断点续跑、去重，再在目标项目中以在线等价的合并逻辑重放。回放阶段带有 processing/processed 状态、group_done_callback、progress_callback、重复 doc 跳过、失败组 snapshot/rollback 和统计字段；tools/merge_raw_units_canonical.py 支持多来源 raw unit 规范化合并并为 source_group_key 加前缀；tools/merge_kg_projects.py 则可合并多个已构图项目的 GraphML、VDB、SQLite KV 和 doc_status，并对 source ids、file_path、description、keywords、weight 与 embedding 做确定性归并。</w:t>
+      </w:r>
+    </w:p>
+    <w:p>
+      <w:pPr>
+        <w:pStyle w:val="3"/>
+      </w:pPr>
+      <w:r>
+        <w:t>证据路径可迁移与解析健壮性</w:t>
+      </w:r>
+    </w:p>
+    <w:p>
+      <w:pPr/>
+      <w:r>
+        <w:t>跨环境复用方面，ragent/portable_paths.py 新增绝对路径归一化，把 file_path、source_ref、image_list、referenced_file_paths 等字段转换为更稳定的项目相对路径。查询缓存 payload、debug payload 和最终引用列表在写入缓存前都会执行 normalize_portable_file_paths，减少 /Volumes、/Users 等本机路径变化对缓存复用、离线回放和报告 trace 的影响。</w:t>
+      </w:r>
+    </w:p>
+    <w:p>
+      <w:pPr/>
+      <w:r>
+        <w:t>解析链路也补上了 MinerU 输出文件名的健壮性处理。integrations.py 现在使用 Path.stem 保留多点文件名的完整 stem，并在预期输出不存在但目录内只有一个对应后缀文件时进行容错解析，避免 WHO_NMH_NHD_13.1_chi.pdf 这类文件被错误截断为 WHO_NMH_NHD_13。该改动虽然不改变 KG-RAG 算法本身，但提升了结构化 ingestion pipeline 对真实 PDF 命名和 MinerU 输出差异的适应能力。</w:t>
+      </w:r>
+    </w:p>
+    <w:p>
+      <w:pPr>
         <w:pStyle w:val="1"/>
         <w:rPr>
           <w:rFonts w:ascii="Times New Roman" w:hAnsi="Times New Roman"/>
@@ -5195,13 +4551,7 @@
         <w:jc w:val="center"/>
       </w:pPr>
       <w:r>
-        <w:t>图</w:t>
-      </w:r>
-      <w:r>
-        <w:t xml:space="preserve"> 1 kg-workbench </w:t>
-      </w:r>
-      <w:r>
-        <w:t>全局图谱与问答工作台主界面</w:t>
+        <w:t>图 1 kg-workbench 全局图谱与问答工作台主界面</w:t>
       </w:r>
     </w:p>
     <w:p>
@@ -5273,25 +4623,7 @@
         <w:spacing w:line="360" w:lineRule="auto"/>
       </w:pPr>
       <w:r>
-        <w:t>表格</w:t>
-      </w:r>
-      <w:r>
-        <w:t xml:space="preserve"> 2 </w:t>
-      </w:r>
-      <w:r>
-        <w:t>代码验证、</w:t>
-      </w:r>
-      <w:r>
-        <w:t xml:space="preserve">benchmark </w:t>
-      </w:r>
-      <w:r>
-        <w:t>与</w:t>
-      </w:r>
-      <w:r>
-        <w:t xml:space="preserve"> trace </w:t>
-      </w:r>
-      <w:r>
-        <w:t>实证摘要</w:t>
+        <w:t>表格 2 代码验证、benchmark 与 trace 实证摘要</w:t>
       </w:r>
     </w:p>
     <w:tbl>
@@ -7817,6 +7149,12 @@
       </w:pPr>
     </w:p>
     <w:p>
+      <w:pPr/>
+      <w:r>
+        <w:t>补充 4 月 17 日后的更新后，可以看到 ragent 的演进方向更加明确：一方面用版本化缓存、批量向量查询和关键词候选缓存降低重复查询成本；另一方面用无 LLM 关键词 fallback、RawMergeUnit 离线回放、多项目合并和 portable path 归一化增强专业文档 KG-RAG 的可复现性和可迁移性。这些更新没有改变“Entity-Relation-Chunk 证据图 + 混合检索 + 可解释 trace”的主线，而是把它从一次性构图/查询流程推进为可恢复、可复用、可验证的长期运行架构。</w:t>
+      </w:r>
+    </w:p>
+    <w:p>
       <w:pPr>
         <w:pStyle w:val="1"/>
         <w:rPr>
@@ -7953,6 +7291,12 @@
       </w:r>
       <w:r>
         <w:t>。</w:t>
+      </w:r>
+    </w:p>
+    <w:p>
+      <w:pPr/>
+      <w:r>
+        <w:t>4 月 17 日后的新增证据模块还包括 ragent/kg/sqlite_kv_impl.py、ragent/kg/sqlite_query_cache_impl.py、ragent/keyword_extraction.py、ragent/offline_replay.py、ragent/inference_runtime.py、ragent/portable_paths.py、ragent/benchmarking.py、ragent/api/benchmark_service.py，以及 tools/export_raw_merge_units.py、tools/replay_raw_merge_units_to_project.py、tools/merge_raw_units_canonical.py、tools/merge_kg_projects.py 和 benchmark/keyword_cache_benefit.py。相关验证可参考 tests/test_query_cache_semantics.py、tests/test_sqlite_query_cache_storage.py、tests/test_ragent_revision_semantics.py、tests/test_keyword_extraction_fallback.py、tests/test_offline_replay_matches_online.py、tests/test_bulk_raw_units_tools.py、tests/test_merge_kg_projects.py 与 tests/test_mineru_output_naming.py。</w:t>
       </w:r>
     </w:p>
     <w:p>
@@ -8084,7 +7428,7 @@
         <w:rFonts w:ascii="宋体" w:cs="宋体"/>
         <w:noProof/>
       </w:rPr>
-      <w:t>16</w:t>
+      <w:t>18</w:t>
     </w:r>
     <w:r>
       <w:rPr>

</xml_diff>

<commit_message>
feat(erc): add traceable RAG benchmark pipeline
Add ERC evidence datasets, evaluation/report tooling, generated research artifacts, and presentation assets.

Add ablation switches for hybrid retrieval, raw export resume controls, replay restore fixes, and tests covering the benchmark/data import paths.
</commit_message>
<xml_diff>
--- a/presentation/Ragent项目改进报告.docx
+++ b/presentation/Ragent项目改进报告.docx
@@ -367,34 +367,6 @@
         </w:p>
         <w:p>
           <w:pPr>
-            <w:pStyle w:val="TOC3"/>
-          </w:pPr>
-          <w:r>
-            <w:t>4.3.4 离线回放、断点续跑与多语料合并</w:t>
-          </w:r>
-          <w:r>
-            <w:tab/>
-          </w:r>
-          <w:r>
-            <w:t>9</w:t>
-          </w:r>
-        </w:p>
-        <w:p>
-          <w:pPr>
-            <w:pStyle w:val="TOC3"/>
-          </w:pPr>
-          <w:r>
-            <w:t>4.3.5 证据路径可迁移与解析健壮性</w:t>
-          </w:r>
-          <w:r>
-            <w:tab/>
-          </w:r>
-          <w:r>
-            <w:t>9</w:t>
-          </w:r>
-        </w:p>
-        <w:p>
-          <w:pPr>
             <w:pStyle w:val="TOC1"/>
           </w:pPr>
           <w:r>
@@ -410,7 +382,7 @@
             <w:tab/>
           </w:r>
           <w:r>
-            <w:t>10</w:t>
+            <w:t>9</w:t>
           </w:r>
         </w:p>
         <w:p>
@@ -424,7 +396,7 @@
             <w:tab/>
           </w:r>
           <w:r>
-            <w:t>10</w:t>
+            <w:t>9</w:t>
           </w:r>
         </w:p>
         <w:p>
@@ -480,7 +452,7 @@
             <w:tab/>
           </w:r>
           <w:r>
-            <w:t>11</w:t>
+            <w:t>10</w:t>
           </w:r>
         </w:p>
         <w:p>
@@ -494,7 +466,7 @@
             <w:tab/>
           </w:r>
           <w:r>
-            <w:t>14</w:t>
+            <w:t>13</w:t>
           </w:r>
         </w:p>
         <w:p>
@@ -508,7 +480,7 @@
             <w:tab/>
           </w:r>
           <w:r>
-            <w:t>14</w:t>
+            <w:t>13</w:t>
           </w:r>
         </w:p>
         <w:p>
@@ -522,7 +494,7 @@
             <w:tab/>
           </w:r>
           <w:r>
-            <w:t>14</w:t>
+            <w:t>13</w:t>
           </w:r>
         </w:p>
         <w:p>
@@ -536,7 +508,7 @@
             <w:tab/>
           </w:r>
           <w:r>
-            <w:t>14</w:t>
+            <w:t>13</w:t>
           </w:r>
         </w:p>
         <w:p>
@@ -550,7 +522,7 @@
             <w:tab/>
           </w:r>
           <w:r>
-            <w:t>15</w:t>
+            <w:t>14</w:t>
           </w:r>
         </w:p>
         <w:p>
@@ -564,7 +536,7 @@
             <w:tab/>
           </w:r>
           <w:r>
-            <w:t>15</w:t>
+            <w:t>14</w:t>
           </w:r>
         </w:p>
         <w:p>
@@ -578,7 +550,7 @@
             <w:tab/>
           </w:r>
           <w:r>
-            <w:t>16</w:t>
+            <w:t>15</w:t>
           </w:r>
         </w:p>
         <w:p>
@@ -587,6 +559,40 @@
           </w:pPr>
           <w:r>
             <w:t>5.4 结论</w:t>
+          </w:r>
+          <w:r>
+            <w:tab/>
+          </w:r>
+          <w:r>
+            <w:t>16</w:t>
+          </w:r>
+        </w:p>
+        <w:p>
+          <w:pPr>
+            <w:pStyle w:val="TOC1"/>
+          </w:pPr>
+          <w:r>
+            <w:tab/>
+          </w:r>
+          <w:r>
+            <w:tab/>
+          </w:r>
+          <w:r>
+            <w:t>6 后续工作：离线回放与确定性图物化</w:t>
+          </w:r>
+          <w:r>
+            <w:tab/>
+          </w:r>
+          <w:r>
+            <w:t>17</w:t>
+          </w:r>
+        </w:p>
+        <w:p>
+          <w:pPr>
+            <w:pStyle w:val="TOC2"/>
+          </w:pPr>
+          <w:r>
+            <w:t>6.1 下一阶段路线</w:t>
           </w:r>
           <w:r>
             <w:tab/>
@@ -606,7 +612,7 @@
             <w:tab/>
           </w:r>
           <w:r>
-            <w:t>6 附录</w:t>
+            <w:t>7 附录</w:t>
           </w:r>
           <w:r>
             <w:tab/>
@@ -620,7 +626,7 @@
             <w:pStyle w:val="TOC2"/>
           </w:pPr>
           <w:r>
-            <w:t>6.1 关键模块与证据清单</w:t>
+            <w:t>7.1 关键模块与证据清单</w:t>
           </w:r>
           <w:r>
             <w:tab/>
@@ -634,7 +640,7 @@
             <w:pStyle w:val="TOC3"/>
           </w:pPr>
           <w:r>
-            <w:t>6.1.1 关键代码、命令与输出文件</w:t>
+            <w:t>7.1.1 关键代码、命令与输出文件</w:t>
           </w:r>
           <w:r>
             <w:tab/>
@@ -839,64 +845,14 @@
         </w:rPr>
       </w:pPr>
       <w:r>
-        <w:t>表格 2 代码验证、benchmark 与 trace 实证摘要</w:t>
+        <w:t>表格 2 关键词候选缓存性能测试摘要</w:t>
       </w:r>
       <w:r>
         <w:tab/>
       </w:r>
       <w:r>
-        <w:t>13</w:t>
-      </w:r>
-    </w:p>
-    <w:p>
-      <w:pPr>
-        <w:pStyle w:val="affa"/>
-        <w:spacing w:before="0" w:after="0"/>
-        <w:jc w:val="left"/>
-        <w:rPr>
-          <w:rFonts w:ascii="Times New Roman" w:eastAsia="宋体" w:hAnsi="Times New Roman"/>
-          <w:color w:val="000000" w:themeColor="text1"/>
-          <w:sz w:val="21"/>
-          <w:szCs w:val="21"/>
-        </w:rPr>
-      </w:pPr>
-      <w:r>
-        <w:rPr>
-          <w:rFonts w:ascii="Times New Roman" w:eastAsia="宋体" w:hAnsi="Times New Roman"/>
-          <w:color w:val="000000" w:themeColor="text1"/>
-          <w:sz w:val="21"/>
-          <w:szCs w:val="21"/>
-        </w:rPr>
-        <w:fldChar w:fldCharType="end"/>
-      </w:r>
-    </w:p>
-    <w:p>
-      <w:pPr>
-        <w:pStyle w:val="affa"/>
-        <w:outlineLvl w:val="0"/>
-        <w:rPr>
-          <w:rFonts w:ascii="Times New Roman" w:eastAsia="宋体" w:hAnsi="Times New Roman"/>
-          <w:color w:val="000000" w:themeColor="text1"/>
-        </w:rPr>
-      </w:pPr>
-      <w:bookmarkStart w:id="1" w:name="_Toc173779168"/>
-      <w:bookmarkStart w:id="2" w:name="_Toc227312832"/>
-      <w:r>
-        <w:rPr>
-          <w:rFonts w:ascii="Times New Roman" w:eastAsia="宋体" w:hAnsi="Times New Roman"/>
-          <w:color w:val="000000" w:themeColor="text1"/>
-        </w:rPr>
-        <w:t xml:space="preserve">Table of contents for the figure </w:t>
-      </w:r>
-      <w:r>
-        <w:rPr>
-          <w:rFonts w:ascii="Times New Roman" w:eastAsia="宋体" w:hAnsi="Times New Roman"/>
-          <w:color w:val="000000" w:themeColor="text1"/>
-        </w:rPr>
-        <w:t>图目录</w:t>
-      </w:r>
-      <w:bookmarkEnd w:id="1"/>
-      <w:bookmarkEnd w:id="2"/>
+        <w:t>9</w:t>
+      </w:r>
     </w:p>
     <w:p>
       <w:pPr>
@@ -914,25 +870,167 @@
         </w:rPr>
       </w:pPr>
       <w:r>
+        <w:t>表格 3 代码验证、benchmark 与 trace 实证摘要</w:t>
+      </w:r>
+      <w:r>
+        <w:tab/>
+      </w:r>
+      <w:r>
+        <w:t>12</w:t>
+      </w:r>
+    </w:p>
+    <w:p>
+      <w:pPr>
+        <w:pStyle w:val="af6"/>
+        <w:tabs>
+          <w:tab w:val="right" w:leader="dot" w:pos="9010"/>
+        </w:tabs>
+        <w:rPr>
+          <w:rFonts w:asciiTheme="minorHAnsi" w:eastAsiaTheme="minorEastAsia" w:hAnsiTheme="minorHAnsi" w:cstheme="minorBidi"/>
+          <w:noProof/>
+          <w:kern w:val="2"/>
+          <w:sz w:val="22"/>
+          <w:szCs w:val="24"/>
+          <w14:ligatures w14:val="standardContextual"/>
+        </w:rPr>
+      </w:pPr>
+      <w:r>
+        <w:t>表格 4 RawMergeUnit 后续研究路线</w:t>
+      </w:r>
+      <w:r>
+        <w:tab/>
+      </w:r>
+      <w:r>
+        <w:t>17</w:t>
+      </w:r>
+    </w:p>
+    <w:p>
+      <w:pPr>
+        <w:pStyle w:val="affa"/>
+        <w:spacing w:before="0" w:after="0"/>
+        <w:jc w:val="left"/>
+        <w:rPr>
+          <w:noProof/>
+        </w:rPr>
+      </w:pPr>
+      <w:r>
+        <w:rPr>
+          <w:rFonts w:ascii="Times New Roman" w:eastAsia="宋体" w:hAnsi="Times New Roman"/>
+          <w:color w:val="000000" w:themeColor="text1"/>
+          <w:sz w:val="21"/>
+          <w:szCs w:val="21"/>
+        </w:rPr>
+        <w:fldChar w:fldCharType="end"/>
+      </w:r>
+      <w:r>
+        <w:rPr>
+          <w:rFonts w:ascii="Times New Roman" w:eastAsia="宋体" w:hAnsi="Times New Roman"/>
+          <w:color w:val="000000" w:themeColor="text1"/>
+          <w:sz w:val="21"/>
+          <w:szCs w:val="21"/>
+        </w:rPr>
+        <w:fldChar w:fldCharType="begin"/>
+      </w:r>
+      <w:r>
+        <w:rPr>
+          <w:rFonts w:ascii="Times New Roman" w:eastAsia="宋体" w:hAnsi="Times New Roman"/>
+          <w:color w:val="000000" w:themeColor="text1"/>
+          <w:sz w:val="21"/>
+          <w:szCs w:val="21"/>
+        </w:rPr>
+        <w:instrText xml:space="preserve"> TOC \h \z \c "</w:instrText>
+      </w:r>
+      <w:r>
+        <w:rPr>
+          <w:rFonts w:ascii="Times New Roman" w:eastAsia="宋体" w:hAnsi="Times New Roman"/>
+          <w:color w:val="000000" w:themeColor="text1"/>
+          <w:sz w:val="21"/>
+          <w:szCs w:val="21"/>
+        </w:rPr>
+        <w:instrText>表格</w:instrText>
+      </w:r>
+      <w:r>
+        <w:rPr>
+          <w:rFonts w:ascii="Times New Roman" w:eastAsia="宋体" w:hAnsi="Times New Roman"/>
+          <w:color w:val="000000" w:themeColor="text1"/>
+          <w:sz w:val="21"/>
+          <w:szCs w:val="21"/>
+        </w:rPr>
+        <w:instrText xml:space="preserve">" </w:instrText>
+      </w:r>
+      <w:r>
+        <w:rPr>
+          <w:rFonts w:ascii="Times New Roman" w:eastAsia="宋体" w:hAnsi="Times New Roman"/>
+          <w:color w:val="000000" w:themeColor="text1"/>
+          <w:sz w:val="21"/>
+          <w:szCs w:val="21"/>
+        </w:rPr>
+        <w:fldChar w:fldCharType="separate"/>
+      </w:r>
+    </w:p>
+    <w:p>
+      <w:pPr>
+        <w:pStyle w:val="affa"/>
+        <w:outlineLvl w:val="0"/>
+        <w:rPr>
+          <w:rFonts w:ascii="Times New Roman" w:eastAsia="宋体" w:hAnsi="Times New Roman"/>
+          <w:color w:val="000000" w:themeColor="text1"/>
+        </w:rPr>
+      </w:pPr>
+      <w:bookmarkStart w:id="1" w:name="_Toc173779168"/>
+      <w:bookmarkStart w:id="2" w:name="_Toc227312832"/>
+      <w:r>
+        <w:rPr>
+          <w:rFonts w:ascii="Times New Roman" w:eastAsia="宋体" w:hAnsi="Times New Roman"/>
+          <w:color w:val="000000" w:themeColor="text1"/>
+        </w:rPr>
+        <w:t xml:space="preserve">Table of contents for the figure </w:t>
+      </w:r>
+      <w:r>
+        <w:rPr>
+          <w:rFonts w:ascii="Times New Roman" w:eastAsia="宋体" w:hAnsi="Times New Roman"/>
+          <w:color w:val="000000" w:themeColor="text1"/>
+        </w:rPr>
+        <w:t>图目录</w:t>
+      </w:r>
+      <w:bookmarkEnd w:id="1"/>
+      <w:bookmarkEnd w:id="2"/>
+    </w:p>
+    <w:p>
+      <w:pPr>
+        <w:pStyle w:val="af6"/>
+        <w:tabs>
+          <w:tab w:val="right" w:leader="dot" w:pos="9010"/>
+        </w:tabs>
+        <w:rPr>
+          <w:rFonts w:asciiTheme="minorHAnsi" w:eastAsiaTheme="minorEastAsia" w:hAnsiTheme="minorHAnsi" w:cstheme="minorBidi"/>
+          <w:noProof/>
+          <w:kern w:val="2"/>
+          <w:sz w:val="22"/>
+          <w:szCs w:val="24"/>
+          <w14:ligatures w14:val="standardContextual"/>
+        </w:rPr>
+      </w:pPr>
+      <w:r>
         <w:t>图 1 kg-workbench 全局图谱与问答工作台主界面</w:t>
       </w:r>
       <w:r>
         <w:tab/>
       </w:r>
       <w:r>
+        <w:t>11</w:t>
+      </w:r>
+      <w:r>
+        <w:br/>
+      </w:r>
+      <w:r>
+        <w:t>图 2 kg-workbench 图谱、证据面板与推理链路联动界面</w:t>
+      </w:r>
+      <w:r>
+        <w:tab/>
+      </w:r>
+      <w:r>
         <w:t>12</w:t>
-      </w:r>
-      <w:r>
-        <w:br/>
-      </w:r>
-      <w:r>
-        <w:t>图 2 kg-workbench 图谱、证据面板与推理链路联动界面</w:t>
-      </w:r>
-      <w:r>
-        <w:tab/>
-      </w:r>
-      <w:r>
-        <w:t>13</w:t>
       </w:r>
     </w:p>
     <w:p>
@@ -3812,7 +3910,932 @@
     <w:p>
       <w:pPr/>
       <w:r>
-        <w:t>5 月 25 日新增的 keyword_candidate 缓存进一步把“关键词变体 -&gt; 向量候选”固化为可复用单元。它支持按 normalized keyword、vector storage、ids、top_k、corpus_revision 和关键词策略构建指纹，并提供 read/write 开关、独立 top_k、TTL 与最大条数限制。现有 keyword cache benchmark 显示，在 graph 检索的 3 个问题样本中，warm 阶段平均 wall time 从约 3.90s 降至 0.56s，下降约 85.66%；hybrid 样本从约 6.01s 降至 5.35s，下降约 10.94%。该 benchmark 使用 only_need_context 和显式关键词，主要验证候选缓存收益，不把最终答案 LLM 的生成耗时混入结论。</w:t>
+        <w:t>5 月 25 日新增的 keyword_candidate 缓存进一步把“关键词变体 -&gt; 向量候选”固化为可复用单元。它支持按 normalized keyword、vector storage、ids、top_k、corpus_revision 和关键词策略构建指纹，并提供 read/write 开关、独立 top_k、TTL 与最大条数限制。表格 2 汇总了本地 keyword cache benefit benchmark 的关键结果：graph 模式在 warm 命中后基本跳过重复 embedding 与向量索引检索，端到端上下文构建耗时下降 77% 以上；hybrid 模式仍保留额外检索和上下文组合开销，因此收益更温和。</w:t>
+      </w:r>
+    </w:p>
+    <w:p>
+      <w:pPr>
+        <w:pStyle w:val="a7"/>
+        <w:jc w:val="center"/>
+      </w:pPr>
+      <w:r>
+        <w:t>表格 2 关键词候选缓存性能测试摘要</w:t>
+      </w:r>
+    </w:p>
+    <w:tbl>
+      <w:tblPr>
+        <w:tblStyle w:val="afe"/>
+        <w:tblW w:type="auto" w:w="0"/>
+        <w:jc w:val="center"/>
+        <w:tblLayout w:type="fixed"/>
+        <w:tblLook w:firstColumn="1" w:firstRow="1" w:lastColumn="0" w:lastRow="0" w:noHBand="0" w:noVBand="1" w:val="04A0"/>
+      </w:tblPr>
+      <w:tblGrid>
+        <w:gridCol w:w="1503"/>
+        <w:gridCol w:w="1503"/>
+        <w:gridCol w:w="1503"/>
+        <w:gridCol w:w="1503"/>
+        <w:gridCol w:w="1503"/>
+        <w:gridCol w:w="1503"/>
+      </w:tblGrid>
+      <w:tr>
+        <w:tc>
+          <w:tcPr>
+            <w:tcW w:type="dxa" w:w="2951"/>
+            <w:vAlign w:val="center"/>
+            <w:shd w:fill="D9EAF7"/>
+          </w:tcPr>
+          <w:p>
+            <w:pPr>
+              <w:spacing w:after="0" w:before="0" w:line="252" w:lineRule="auto"/>
+              <w:jc w:val="center"/>
+            </w:pPr>
+            <w:r>
+              <w:rPr>
+                <w:b/>
+                <w:sz w:val="16"/>
+              </w:rPr>
+            </w:r>
+            <w:r>
+              <w:rPr>
+                <w:b/>
+                <w:sz w:val="16"/>
+              </w:rPr>
+              <w:t>测试场景（mode）</w:t>
+            </w:r>
+          </w:p>
+        </w:tc>
+        <w:tc>
+          <w:tcPr>
+            <w:tcW w:type="dxa" w:w="1224"/>
+            <w:vAlign w:val="center"/>
+            <w:shd w:fill="D9EAF7"/>
+          </w:tcPr>
+          <w:p>
+            <w:pPr>
+              <w:spacing w:after="0" w:before="0" w:line="252" w:lineRule="auto"/>
+              <w:jc w:val="center"/>
+            </w:pPr>
+            <w:r>
+              <w:rPr>
+                <w:b/>
+                <w:sz w:val="16"/>
+              </w:rPr>
+            </w:r>
+            <w:r>
+              <w:rPr>
+                <w:b/>
+                <w:sz w:val="16"/>
+              </w:rPr>
+              <w:t>cold 均值(s)</w:t>
+            </w:r>
+          </w:p>
+        </w:tc>
+        <w:tc>
+          <w:tcPr>
+            <w:tcW w:type="dxa" w:w="1655"/>
+            <w:vAlign w:val="center"/>
+            <w:shd w:fill="D9EAF7"/>
+          </w:tcPr>
+          <w:p>
+            <w:pPr>
+              <w:spacing w:after="0" w:before="0" w:line="252" w:lineRule="auto"/>
+              <w:jc w:val="center"/>
+            </w:pPr>
+            <w:r>
+              <w:rPr>
+                <w:b/>
+                <w:sz w:val="16"/>
+              </w:rPr>
+            </w:r>
+            <w:r>
+              <w:rPr>
+                <w:b/>
+                <w:sz w:val="16"/>
+              </w:rPr>
+              <w:t>prewarm/write(s)</w:t>
+            </w:r>
+          </w:p>
+        </w:tc>
+        <w:tc>
+          <w:tcPr>
+            <w:tcW w:type="dxa" w:w="2088"/>
+            <w:vAlign w:val="center"/>
+            <w:shd w:fill="D9EAF7"/>
+          </w:tcPr>
+          <w:p>
+            <w:pPr>
+              <w:spacing w:after="0" w:before="0" w:line="252" w:lineRule="auto"/>
+              <w:jc w:val="center"/>
+            </w:pPr>
+            <w:r>
+              <w:rPr>
+                <w:b/>
+                <w:sz w:val="16"/>
+              </w:rPr>
+            </w:r>
+            <w:r>
+              <w:rPr>
+                <w:b/>
+                <w:sz w:val="16"/>
+              </w:rPr>
+              <w:t>warm/read(s)</w:t>
+            </w:r>
+          </w:p>
+        </w:tc>
+        <w:tc>
+          <w:tcPr>
+            <w:tcW w:type="dxa" w:w="1080"/>
+            <w:vAlign w:val="center"/>
+            <w:shd w:fill="D9EAF7"/>
+          </w:tcPr>
+          <w:p>
+            <w:pPr>
+              <w:spacing w:after="0" w:before="0" w:line="252" w:lineRule="auto"/>
+              <w:jc w:val="center"/>
+            </w:pPr>
+            <w:r>
+              <w:rPr>
+                <w:b/>
+                <w:sz w:val="16"/>
+              </w:rPr>
+            </w:r>
+            <w:r>
+              <w:rPr>
+                <w:b/>
+                <w:sz w:val="16"/>
+              </w:rPr>
+              <w:t>warm 命中</w:t>
+            </w:r>
+          </w:p>
+        </w:tc>
+        <w:tc>
+          <w:tcPr>
+            <w:tcW w:type="dxa" w:w="1224"/>
+            <w:vAlign w:val="center"/>
+            <w:shd w:fill="D9EAF7"/>
+          </w:tcPr>
+          <w:p>
+            <w:pPr>
+              <w:spacing w:after="0" w:before="0" w:line="252" w:lineRule="auto"/>
+              <w:jc w:val="center"/>
+            </w:pPr>
+            <w:r>
+              <w:rPr>
+                <w:b/>
+                <w:sz w:val="16"/>
+              </w:rPr>
+            </w:r>
+            <w:r>
+              <w:rPr>
+                <w:b/>
+                <w:sz w:val="16"/>
+              </w:rPr>
+              <w:t>耗时下降</w:t>
+            </w:r>
+          </w:p>
+        </w:tc>
+      </w:tr>
+      <w:tr>
+        <w:tc>
+          <w:tcPr>
+            <w:tcW w:type="dxa" w:w="2951"/>
+            <w:vAlign w:val="center"/>
+          </w:tcPr>
+          <w:p>
+            <w:pPr>
+              <w:spacing w:after="0" w:before="0" w:line="252" w:lineRule="auto"/>
+              <w:jc w:val="left"/>
+            </w:pPr>
+            <w:r>
+              <w:rPr>
+                <w:sz w:val="16"/>
+              </w:rPr>
+            </w:r>
+            <w:r>
+              <w:rPr>
+                <w:b w:val="0"/>
+                <w:sz w:val="16"/>
+              </w:rPr>
+              <w:t>手工关键词，top_k=20（graph）</w:t>
+            </w:r>
+          </w:p>
+        </w:tc>
+        <w:tc>
+          <w:tcPr>
+            <w:tcW w:type="dxa" w:w="1224"/>
+            <w:vAlign w:val="center"/>
+          </w:tcPr>
+          <w:p>
+            <w:pPr>
+              <w:spacing w:after="0" w:before="0" w:line="252" w:lineRule="auto"/>
+              <w:jc w:val="center"/>
+            </w:pPr>
+            <w:r>
+              <w:rPr>
+                <w:sz w:val="16"/>
+              </w:rPr>
+            </w:r>
+            <w:r>
+              <w:rPr>
+                <w:b w:val="0"/>
+                <w:sz w:val="16"/>
+              </w:rPr>
+              <w:t>3.74</w:t>
+            </w:r>
+          </w:p>
+        </w:tc>
+        <w:tc>
+          <w:tcPr>
+            <w:tcW w:type="dxa" w:w="1655"/>
+            <w:vAlign w:val="center"/>
+          </w:tcPr>
+          <w:p>
+            <w:pPr>
+              <w:spacing w:after="0" w:before="0" w:line="252" w:lineRule="auto"/>
+              <w:jc w:val="center"/>
+            </w:pPr>
+            <w:r>
+              <w:rPr>
+                <w:sz w:val="16"/>
+              </w:rPr>
+            </w:r>
+            <w:r>
+              <w:rPr>
+                <w:b w:val="0"/>
+                <w:sz w:val="16"/>
+              </w:rPr>
+              <w:t>3.51</w:t>
+            </w:r>
+          </w:p>
+        </w:tc>
+        <w:tc>
+          <w:tcPr>
+            <w:tcW w:type="dxa" w:w="2088"/>
+            <w:vAlign w:val="center"/>
+          </w:tcPr>
+          <w:p>
+            <w:pPr>
+              <w:spacing w:after="0" w:before="0" w:line="252" w:lineRule="auto"/>
+              <w:jc w:val="center"/>
+            </w:pPr>
+            <w:r>
+              <w:rPr>
+                <w:sz w:val="16"/>
+              </w:rPr>
+            </w:r>
+            <w:r>
+              <w:rPr>
+                <w:b w:val="0"/>
+                <w:sz w:val="16"/>
+              </w:rPr>
+              <w:t>0.85</w:t>
+            </w:r>
+          </w:p>
+        </w:tc>
+        <w:tc>
+          <w:tcPr>
+            <w:tcW w:type="dxa" w:w="1080"/>
+            <w:vAlign w:val="center"/>
+          </w:tcPr>
+          <w:p>
+            <w:pPr>
+              <w:spacing w:after="0" w:before="0" w:line="252" w:lineRule="auto"/>
+              <w:jc w:val="center"/>
+            </w:pPr>
+            <w:r>
+              <w:rPr>
+                <w:sz w:val="16"/>
+              </w:rPr>
+            </w:r>
+            <w:r>
+              <w:rPr>
+                <w:b w:val="0"/>
+                <w:sz w:val="16"/>
+              </w:rPr>
+              <w:t>24</w:t>
+            </w:r>
+          </w:p>
+        </w:tc>
+        <w:tc>
+          <w:tcPr>
+            <w:tcW w:type="dxa" w:w="1224"/>
+            <w:vAlign w:val="center"/>
+          </w:tcPr>
+          <w:p>
+            <w:pPr>
+              <w:spacing w:after="0" w:before="0" w:line="252" w:lineRule="auto"/>
+              <w:jc w:val="center"/>
+            </w:pPr>
+            <w:r>
+              <w:rPr>
+                <w:sz w:val="16"/>
+              </w:rPr>
+            </w:r>
+            <w:r>
+              <w:rPr>
+                <w:b w:val="0"/>
+                <w:sz w:val="16"/>
+              </w:rPr>
+              <w:t>77.36%</w:t>
+            </w:r>
+          </w:p>
+        </w:tc>
+      </w:tr>
+      <w:tr>
+        <w:tc>
+          <w:tcPr>
+            <w:tcW w:type="dxa" w:w="2951"/>
+            <w:vAlign w:val="center"/>
+          </w:tcPr>
+          <w:p>
+            <w:pPr>
+              <w:spacing w:after="0" w:before="0" w:line="252" w:lineRule="auto"/>
+              <w:jc w:val="left"/>
+            </w:pPr>
+            <w:r>
+              <w:rPr>
+                <w:sz w:val="16"/>
+              </w:rPr>
+            </w:r>
+            <w:r>
+              <w:rPr>
+                <w:b w:val="0"/>
+                <w:sz w:val="16"/>
+              </w:rPr>
+              <w:t>read/write 拆分，top_k=20（graph）</w:t>
+            </w:r>
+          </w:p>
+        </w:tc>
+        <w:tc>
+          <w:tcPr>
+            <w:tcW w:type="dxa" w:w="1224"/>
+            <w:vAlign w:val="center"/>
+          </w:tcPr>
+          <w:p>
+            <w:pPr>
+              <w:spacing w:after="0" w:before="0" w:line="252" w:lineRule="auto"/>
+              <w:jc w:val="center"/>
+            </w:pPr>
+            <w:r>
+              <w:rPr>
+                <w:sz w:val="16"/>
+              </w:rPr>
+            </w:r>
+            <w:r>
+              <w:rPr>
+                <w:b w:val="0"/>
+                <w:sz w:val="16"/>
+              </w:rPr>
+              <w:t>3.90</w:t>
+            </w:r>
+          </w:p>
+        </w:tc>
+        <w:tc>
+          <w:tcPr>
+            <w:tcW w:type="dxa" w:w="1655"/>
+            <w:vAlign w:val="center"/>
+          </w:tcPr>
+          <w:p>
+            <w:pPr>
+              <w:spacing w:after="0" w:before="0" w:line="252" w:lineRule="auto"/>
+              <w:jc w:val="center"/>
+            </w:pPr>
+            <w:r>
+              <w:rPr>
+                <w:sz w:val="16"/>
+              </w:rPr>
+            </w:r>
+            <w:r>
+              <w:rPr>
+                <w:b w:val="0"/>
+                <w:sz w:val="16"/>
+              </w:rPr>
+              <w:t>3.89 write-only</w:t>
+            </w:r>
+          </w:p>
+        </w:tc>
+        <w:tc>
+          <w:tcPr>
+            <w:tcW w:type="dxa" w:w="2088"/>
+            <w:vAlign w:val="center"/>
+          </w:tcPr>
+          <w:p>
+            <w:pPr>
+              <w:spacing w:after="0" w:before="0" w:line="252" w:lineRule="auto"/>
+              <w:jc w:val="center"/>
+            </w:pPr>
+            <w:r>
+              <w:rPr>
+                <w:sz w:val="16"/>
+              </w:rPr>
+            </w:r>
+            <w:r>
+              <w:rPr>
+                <w:b w:val="0"/>
+                <w:sz w:val="16"/>
+              </w:rPr>
+              <w:t>0.56 enabled / 0.64 read-only</w:t>
+            </w:r>
+          </w:p>
+        </w:tc>
+        <w:tc>
+          <w:tcPr>
+            <w:tcW w:type="dxa" w:w="1080"/>
+            <w:vAlign w:val="center"/>
+          </w:tcPr>
+          <w:p>
+            <w:pPr>
+              <w:spacing w:after="0" w:before="0" w:line="252" w:lineRule="auto"/>
+              <w:jc w:val="center"/>
+            </w:pPr>
+            <w:r>
+              <w:rPr>
+                <w:sz w:val="16"/>
+              </w:rPr>
+            </w:r>
+            <w:r>
+              <w:rPr>
+                <w:b w:val="0"/>
+                <w:sz w:val="16"/>
+              </w:rPr>
+              <w:t>24</w:t>
+            </w:r>
+          </w:p>
+        </w:tc>
+        <w:tc>
+          <w:tcPr>
+            <w:tcW w:type="dxa" w:w="1224"/>
+            <w:vAlign w:val="center"/>
+          </w:tcPr>
+          <w:p>
+            <w:pPr>
+              <w:spacing w:after="0" w:before="0" w:line="252" w:lineRule="auto"/>
+              <w:jc w:val="center"/>
+            </w:pPr>
+            <w:r>
+              <w:rPr>
+                <w:sz w:val="16"/>
+              </w:rPr>
+            </w:r>
+            <w:r>
+              <w:rPr>
+                <w:b w:val="0"/>
+                <w:sz w:val="16"/>
+              </w:rPr>
+              <w:t>85.66%</w:t>
+            </w:r>
+          </w:p>
+        </w:tc>
+      </w:tr>
+      <w:tr>
+        <w:tc>
+          <w:tcPr>
+            <w:tcW w:type="dxa" w:w="2951"/>
+            <w:vAlign w:val="center"/>
+          </w:tcPr>
+          <w:p>
+            <w:pPr>
+              <w:spacing w:after="0" w:before="0" w:line="252" w:lineRule="auto"/>
+              <w:jc w:val="left"/>
+            </w:pPr>
+            <w:r>
+              <w:rPr>
+                <w:sz w:val="16"/>
+              </w:rPr>
+            </w:r>
+            <w:r>
+              <w:rPr>
+                <w:b w:val="0"/>
+                <w:sz w:val="16"/>
+              </w:rPr>
+              <w:t>keyword_cache_top_k=24（graph）</w:t>
+            </w:r>
+          </w:p>
+        </w:tc>
+        <w:tc>
+          <w:tcPr>
+            <w:tcW w:type="dxa" w:w="1224"/>
+            <w:vAlign w:val="center"/>
+          </w:tcPr>
+          <w:p>
+            <w:pPr>
+              <w:spacing w:after="0" w:before="0" w:line="252" w:lineRule="auto"/>
+              <w:jc w:val="center"/>
+            </w:pPr>
+            <w:r>
+              <w:rPr>
+                <w:sz w:val="16"/>
+              </w:rPr>
+            </w:r>
+            <w:r>
+              <w:rPr>
+                <w:b w:val="0"/>
+                <w:sz w:val="16"/>
+              </w:rPr>
+              <w:t>4.47</w:t>
+            </w:r>
+          </w:p>
+        </w:tc>
+        <w:tc>
+          <w:tcPr>
+            <w:tcW w:type="dxa" w:w="1655"/>
+            <w:vAlign w:val="center"/>
+          </w:tcPr>
+          <w:p>
+            <w:pPr>
+              <w:spacing w:after="0" w:before="0" w:line="252" w:lineRule="auto"/>
+              <w:jc w:val="center"/>
+            </w:pPr>
+            <w:r>
+              <w:rPr>
+                <w:sz w:val="16"/>
+              </w:rPr>
+            </w:r>
+            <w:r>
+              <w:rPr>
+                <w:b w:val="0"/>
+                <w:sz w:val="16"/>
+              </w:rPr>
+              <w:t>3.78</w:t>
+            </w:r>
+          </w:p>
+        </w:tc>
+        <w:tc>
+          <w:tcPr>
+            <w:tcW w:type="dxa" w:w="2088"/>
+            <w:vAlign w:val="center"/>
+          </w:tcPr>
+          <w:p>
+            <w:pPr>
+              <w:spacing w:after="0" w:before="0" w:line="252" w:lineRule="auto"/>
+              <w:jc w:val="center"/>
+            </w:pPr>
+            <w:r>
+              <w:rPr>
+                <w:sz w:val="16"/>
+              </w:rPr>
+            </w:r>
+            <w:r>
+              <w:rPr>
+                <w:b w:val="0"/>
+                <w:sz w:val="16"/>
+              </w:rPr>
+              <w:t>0.55</w:t>
+            </w:r>
+          </w:p>
+        </w:tc>
+        <w:tc>
+          <w:tcPr>
+            <w:tcW w:type="dxa" w:w="1080"/>
+            <w:vAlign w:val="center"/>
+          </w:tcPr>
+          <w:p>
+            <w:pPr>
+              <w:spacing w:after="0" w:before="0" w:line="252" w:lineRule="auto"/>
+              <w:jc w:val="center"/>
+            </w:pPr>
+            <w:r>
+              <w:rPr>
+                <w:sz w:val="16"/>
+              </w:rPr>
+            </w:r>
+            <w:r>
+              <w:rPr>
+                <w:b w:val="0"/>
+                <w:sz w:val="16"/>
+              </w:rPr>
+              <w:t>24</w:t>
+            </w:r>
+          </w:p>
+        </w:tc>
+        <w:tc>
+          <w:tcPr>
+            <w:tcW w:type="dxa" w:w="1224"/>
+            <w:vAlign w:val="center"/>
+          </w:tcPr>
+          <w:p>
+            <w:pPr>
+              <w:spacing w:after="0" w:before="0" w:line="252" w:lineRule="auto"/>
+              <w:jc w:val="center"/>
+            </w:pPr>
+            <w:r>
+              <w:rPr>
+                <w:sz w:val="16"/>
+              </w:rPr>
+            </w:r>
+            <w:r>
+              <w:rPr>
+                <w:b w:val="0"/>
+                <w:sz w:val="16"/>
+              </w:rPr>
+              <w:t>87.71%</w:t>
+            </w:r>
+          </w:p>
+        </w:tc>
+      </w:tr>
+      <w:tr>
+        <w:tc>
+          <w:tcPr>
+            <w:tcW w:type="dxa" w:w="2951"/>
+            <w:vAlign w:val="center"/>
+          </w:tcPr>
+          <w:p>
+            <w:pPr>
+              <w:spacing w:after="0" w:before="0" w:line="252" w:lineRule="auto"/>
+              <w:jc w:val="left"/>
+            </w:pPr>
+            <w:r>
+              <w:rPr>
+                <w:sz w:val="16"/>
+              </w:rPr>
+            </w:r>
+            <w:r>
+              <w:rPr>
+                <w:b w:val="0"/>
+                <w:sz w:val="16"/>
+              </w:rPr>
+              <w:t>warm_top_k=10（graph）</w:t>
+            </w:r>
+          </w:p>
+        </w:tc>
+        <w:tc>
+          <w:tcPr>
+            <w:tcW w:type="dxa" w:w="1224"/>
+            <w:vAlign w:val="center"/>
+          </w:tcPr>
+          <w:p>
+            <w:pPr>
+              <w:spacing w:after="0" w:before="0" w:line="252" w:lineRule="auto"/>
+              <w:jc w:val="center"/>
+            </w:pPr>
+            <w:r>
+              <w:rPr>
+                <w:sz w:val="16"/>
+              </w:rPr>
+            </w:r>
+            <w:r>
+              <w:rPr>
+                <w:b w:val="0"/>
+                <w:sz w:val="16"/>
+              </w:rPr>
+              <w:t>4.98</w:t>
+            </w:r>
+          </w:p>
+        </w:tc>
+        <w:tc>
+          <w:tcPr>
+            <w:tcW w:type="dxa" w:w="1655"/>
+            <w:vAlign w:val="center"/>
+          </w:tcPr>
+          <w:p>
+            <w:pPr>
+              <w:spacing w:after="0" w:before="0" w:line="252" w:lineRule="auto"/>
+              <w:jc w:val="center"/>
+            </w:pPr>
+            <w:r>
+              <w:rPr>
+                <w:sz w:val="16"/>
+              </w:rPr>
+            </w:r>
+            <w:r>
+              <w:rPr>
+                <w:b w:val="0"/>
+                <w:sz w:val="16"/>
+              </w:rPr>
+              <w:t>3.20</w:t>
+            </w:r>
+          </w:p>
+        </w:tc>
+        <w:tc>
+          <w:tcPr>
+            <w:tcW w:type="dxa" w:w="2088"/>
+            <w:vAlign w:val="center"/>
+          </w:tcPr>
+          <w:p>
+            <w:pPr>
+              <w:spacing w:after="0" w:before="0" w:line="252" w:lineRule="auto"/>
+              <w:jc w:val="center"/>
+            </w:pPr>
+            <w:r>
+              <w:rPr>
+                <w:sz w:val="16"/>
+              </w:rPr>
+            </w:r>
+            <w:r>
+              <w:rPr>
+                <w:b w:val="0"/>
+                <w:sz w:val="16"/>
+              </w:rPr>
+              <w:t>0.59</w:t>
+            </w:r>
+          </w:p>
+        </w:tc>
+        <w:tc>
+          <w:tcPr>
+            <w:tcW w:type="dxa" w:w="1080"/>
+            <w:vAlign w:val="center"/>
+          </w:tcPr>
+          <w:p>
+            <w:pPr>
+              <w:spacing w:after="0" w:before="0" w:line="252" w:lineRule="auto"/>
+              <w:jc w:val="center"/>
+            </w:pPr>
+            <w:r>
+              <w:rPr>
+                <w:sz w:val="16"/>
+              </w:rPr>
+            </w:r>
+            <w:r>
+              <w:rPr>
+                <w:b w:val="0"/>
+                <w:sz w:val="16"/>
+              </w:rPr>
+              <w:t>24</w:t>
+            </w:r>
+          </w:p>
+        </w:tc>
+        <w:tc>
+          <w:tcPr>
+            <w:tcW w:type="dxa" w:w="1224"/>
+            <w:vAlign w:val="center"/>
+          </w:tcPr>
+          <w:p>
+            <w:pPr>
+              <w:spacing w:after="0" w:before="0" w:line="252" w:lineRule="auto"/>
+              <w:jc w:val="center"/>
+            </w:pPr>
+            <w:r>
+              <w:rPr>
+                <w:sz w:val="16"/>
+              </w:rPr>
+            </w:r>
+            <w:r>
+              <w:rPr>
+                <w:b w:val="0"/>
+                <w:sz w:val="16"/>
+              </w:rPr>
+              <w:t>88.11%</w:t>
+            </w:r>
+          </w:p>
+        </w:tc>
+      </w:tr>
+      <w:tr>
+        <w:tc>
+          <w:tcPr>
+            <w:tcW w:type="dxa" w:w="2951"/>
+            <w:vAlign w:val="center"/>
+          </w:tcPr>
+          <w:p>
+            <w:pPr>
+              <w:spacing w:after="0" w:before="0" w:line="252" w:lineRule="auto"/>
+              <w:jc w:val="left"/>
+            </w:pPr>
+            <w:r>
+              <w:rPr>
+                <w:sz w:val="16"/>
+              </w:rPr>
+            </w:r>
+            <w:r>
+              <w:rPr>
+                <w:b w:val="0"/>
+                <w:sz w:val="16"/>
+              </w:rPr>
+              <w:t>混合检索，top_k=20（hybrid）</w:t>
+            </w:r>
+          </w:p>
+        </w:tc>
+        <w:tc>
+          <w:tcPr>
+            <w:tcW w:type="dxa" w:w="1224"/>
+            <w:vAlign w:val="center"/>
+          </w:tcPr>
+          <w:p>
+            <w:pPr>
+              <w:spacing w:after="0" w:before="0" w:line="252" w:lineRule="auto"/>
+              <w:jc w:val="center"/>
+            </w:pPr>
+            <w:r>
+              <w:rPr>
+                <w:sz w:val="16"/>
+              </w:rPr>
+            </w:r>
+            <w:r>
+              <w:rPr>
+                <w:b w:val="0"/>
+                <w:sz w:val="16"/>
+              </w:rPr>
+              <w:t>6.01</w:t>
+            </w:r>
+          </w:p>
+        </w:tc>
+        <w:tc>
+          <w:tcPr>
+            <w:tcW w:type="dxa" w:w="1655"/>
+            <w:vAlign w:val="center"/>
+          </w:tcPr>
+          <w:p>
+            <w:pPr>
+              <w:spacing w:after="0" w:before="0" w:line="252" w:lineRule="auto"/>
+              <w:jc w:val="center"/>
+            </w:pPr>
+            <w:r>
+              <w:rPr>
+                <w:sz w:val="16"/>
+              </w:rPr>
+            </w:r>
+            <w:r>
+              <w:rPr>
+                <w:b w:val="0"/>
+                <w:sz w:val="16"/>
+              </w:rPr>
+              <w:t>5.10</w:t>
+            </w:r>
+          </w:p>
+        </w:tc>
+        <w:tc>
+          <w:tcPr>
+            <w:tcW w:type="dxa" w:w="2088"/>
+            <w:vAlign w:val="center"/>
+          </w:tcPr>
+          <w:p>
+            <w:pPr>
+              <w:spacing w:after="0" w:before="0" w:line="252" w:lineRule="auto"/>
+              <w:jc w:val="center"/>
+            </w:pPr>
+            <w:r>
+              <w:rPr>
+                <w:sz w:val="16"/>
+              </w:rPr>
+            </w:r>
+            <w:r>
+              <w:rPr>
+                <w:b w:val="0"/>
+                <w:sz w:val="16"/>
+              </w:rPr>
+              <w:t>5.35</w:t>
+            </w:r>
+          </w:p>
+        </w:tc>
+        <w:tc>
+          <w:tcPr>
+            <w:tcW w:type="dxa" w:w="1080"/>
+            <w:vAlign w:val="center"/>
+          </w:tcPr>
+          <w:p>
+            <w:pPr>
+              <w:spacing w:after="0" w:before="0" w:line="252" w:lineRule="auto"/>
+              <w:jc w:val="center"/>
+            </w:pPr>
+            <w:r>
+              <w:rPr>
+                <w:sz w:val="16"/>
+              </w:rPr>
+            </w:r>
+            <w:r>
+              <w:rPr>
+                <w:b w:val="0"/>
+                <w:sz w:val="16"/>
+              </w:rPr>
+              <w:t>24</w:t>
+            </w:r>
+          </w:p>
+        </w:tc>
+        <w:tc>
+          <w:tcPr>
+            <w:tcW w:type="dxa" w:w="1224"/>
+            <w:vAlign w:val="center"/>
+          </w:tcPr>
+          <w:p>
+            <w:pPr>
+              <w:spacing w:after="0" w:before="0" w:line="252" w:lineRule="auto"/>
+              <w:jc w:val="center"/>
+            </w:pPr>
+            <w:r>
+              <w:rPr>
+                <w:sz w:val="16"/>
+              </w:rPr>
+            </w:r>
+            <w:r>
+              <w:rPr>
+                <w:b w:val="0"/>
+                <w:sz w:val="16"/>
+              </w:rPr>
+              <w:t>10.94%</w:t>
+            </w:r>
+          </w:p>
+        </w:tc>
+      </w:tr>
+    </w:tbl>
+    <w:p>
+      <w:pPr>
+        <w:jc w:val="left"/>
+      </w:pPr>
+      <w:r>
+        <w:rPr>
+          <w:sz w:val="18"/>
+        </w:rPr>
+        <w:t>说明：数据来自 benchmark/keyword_cache_benefit_qwen4b_* 的 summary.md，均为每阶段 3 个问题、每问题 1 次 run。graph warm 阶段 keyword hits=24，embedding/index/entity/relation 向量检索统计为 0.0s，说明缓存命中后跳过了关键词变体候选的重复向量召回；hybrid 行的收益较低，主要因为仍有非图候选检索、上下文组合和渲染开销。</w:t>
       </w:r>
     </w:p>
     <w:p>
@@ -3833,46 +4856,6 @@
       <w:pPr/>
       <w:r>
         <w:t>针对中文短问句和泛化问题，keyword_extraction.py 增加了本地 CJK 切词、GLiNER words splitter patch、langdetect stub 和 token candidate fallback；operate.py 则在 query-only fallback 为空时，从首轮向量证据的文件名、source_ref、section_path、标题和首行文本中反推信息量更高的关键词。与此同时，5 月 12 日的关键词后处理调整保留了部分 generic keywords，避免把“指南、标准、肥胖食养、能量消耗”这类看似泛化但对专业语料定位很关键的词过早过滤掉。</w:t>
-      </w:r>
-    </w:p>
-    <w:p>
-      <w:pPr>
-        <w:pStyle w:val="3"/>
-      </w:pPr>
-      <w:r>
-        <w:t>离线回放、断点续跑与多语料合并</w:t>
-      </w:r>
-    </w:p>
-    <w:p>
-      <w:pPr/>
-      <w:r>
-        <w:t>构图架构新增 RawMergeUnit 作为可序列化中间层，把文档内容、chunk、vector chunk、实体/关系抽取结果、source_group_key 和 metadata 封装成 JSONL。tools/export_raw_merge_units.py 可先批量导出抽取单元，支持 resume、失败记录、进度 JSONL 和成功记录；ragent/offline_replay.py 再按 source_group_key 分组回放，写入 full_docs、text_chunks、chunks_vdb、doc_status，并调用与在线入库相同的 merge_nodes_and_edges 完成最终图谱合并。</w:t>
-      </w:r>
-    </w:p>
-    <w:p>
-      <w:pPr/>
-      <w:r>
-        <w:t>这个拆分使“抽取”和“最终合图”解耦：大规模语料可以先分片抽取、断点续跑、去重，再在目标项目中以在线等价的合并逻辑重放。回放阶段带有 processing/processed 状态、group_done_callback、progress_callback、重复 doc 跳过、失败组 snapshot/rollback 和统计字段；tools/merge_raw_units_canonical.py 支持多来源 raw unit 规范化合并并为 source_group_key 加前缀；tools/merge_kg_projects.py 则可合并多个已构图项目的 GraphML、VDB、SQLite KV 和 doc_status，并对 source ids、file_path、description、keywords、weight 与 embedding 做确定性归并。</w:t>
-      </w:r>
-    </w:p>
-    <w:p>
-      <w:pPr>
-        <w:pStyle w:val="3"/>
-      </w:pPr>
-      <w:r>
-        <w:t>证据路径可迁移与解析健壮性</w:t>
-      </w:r>
-    </w:p>
-    <w:p>
-      <w:pPr/>
-      <w:r>
-        <w:t>跨环境复用方面，ragent/portable_paths.py 新增绝对路径归一化，把 file_path、source_ref、image_list、referenced_file_paths 等字段转换为更稳定的项目相对路径。查询缓存 payload、debug payload 和最终引用列表在写入缓存前都会执行 normalize_portable_file_paths，减少 /Volumes、/Users 等本机路径变化对缓存复用、离线回放和报告 trace 的影响。</w:t>
-      </w:r>
-    </w:p>
-    <w:p>
-      <w:pPr/>
-      <w:r>
-        <w:t>解析链路也补上了 MinerU 输出文件名的健壮性处理。integrations.py 现在使用 Path.stem 保留多点文件名的完整 stem，并在预期输出不存在但目录内只有一个对应后缀文件时进行容错解析，避免 WHO_NMH_NHD_13.1_chi.pdf 这类文件被错误截断为 WHO_NMH_NHD_13。该改动虽然不改变 KG-RAG 算法本身，但提升了结构化 ingestion pipeline 对真实 PDF 命名和 MinerU 输出差异的适应能力。</w:t>
       </w:r>
     </w:p>
     <w:p>
@@ -4623,7 +5606,7 @@
         <w:spacing w:line="360" w:lineRule="auto"/>
       </w:pPr>
       <w:r>
-        <w:t>表格 2 代码验证、benchmark 与 trace 实证摘要</w:t>
+        <w:t>表格 3 代码验证、benchmark 与 trace 实证摘要</w:t>
       </w:r>
     </w:p>
     <w:tbl>
@@ -7151,7 +8134,664 @@
     <w:p>
       <w:pPr/>
       <w:r>
-        <w:t>补充 4 月 17 日后的更新后，可以看到 ragent 的演进方向更加明确：一方面用版本化缓存、批量向量查询和关键词候选缓存降低重复查询成本；另一方面用无 LLM 关键词 fallback、RawMergeUnit 离线回放、多项目合并和 portable path 归一化增强专业文档 KG-RAG 的可复现性和可迁移性。这些更新没有改变“Entity-Relation-Chunk 证据图 + 混合检索 + 可解释 trace”的主线，而是把它从一次性构图/查询流程推进为可恢复、可复用、可验证的长期运行架构。</w:t>
+        <w:t>补充 4 月 17 日后的更新后，可以看到 ragent 的演进方向更加明确：一方面用版本化缓存、批量向量查询和关键词候选缓存降低重复查询成本；另一方面用无 LLM 关键词 fallback 增强 retrieval-only 场景的调用边界与稳定性。这些更新没有改变“Entity-Relation-Chunk 证据图 + 混合检索 + 可解释 trace”的主线，而是把查询链路推进为可缓存、可降级、可度量的长期运行架构；离线回放、多项目合并和确定性图物化的后续方向则在下一节单独展开。</w:t>
+      </w:r>
+    </w:p>
+    <w:p>
+      <w:pPr>
+        <w:pStyle w:val="1"/>
+        <w:pageBreakBefore/>
+      </w:pPr>
+      <w:r>
+        <w:t>后续工作：离线回放与确定性图物化</w:t>
+      </w:r>
+    </w:p>
+    <w:p>
+      <w:r>
+        <w:t>RawMergeUnit 更适合放在主文末尾，因为它不只是一次已完成的工程优化，而是下一阶段知识图谱构建方法继续展开的入口。当前实现已经把文档内容、chunk、vector chunk、实体/关系抽取结果、source_group_key 和 metadata 封装成 JSONL，使抽取、回放和最终合图解耦；export/replay 工具支持 resume、失败记录、进度记录、分组回放、snapshot/rollback 和多项目合并，从而为可恢复、可重放的构图流程提供基础。</w:t>
+      </w:r>
+    </w:p>
+    <w:p>
+      <w:r>
+        <w:t>docs/research/review_round_3.md 进一步把后续研究问题收敛为 Resolution-Structure Circular Dependency：实体解析需要依赖当前图结构，而图结构又会被并发解析结果持续改写。若继续沿“抽取后直接写主图”的路径扩展，容易出现不可重放、重复实体、错误合并传播和热点实体锁竞争。后续工作应把 RawMergeUnit 从“可回放中间产物”推进为 mention/event log 与确定性图物化协议的底座。</w:t>
+      </w:r>
+    </w:p>
+    <w:p>
+      <w:pPr>
+        <w:pStyle w:val="2"/>
+      </w:pPr>
+      <w:r>
+        <w:t>下一阶段路线</w:t>
+      </w:r>
+    </w:p>
+    <w:p>
+      <w:r>
+        <w:t>结合 round 3 设计文档，后续方向可以收敛为四层：append-only mention log 切断 LLM 抽取与 canonical KG 写入；epoch snapshot resolution 让同一批 mention 基于固定图快照生成 tentative decisions；merge_existing、create_canonical、create_provisional、defer 四分决策在支持新实体增长的同时控制错误合并；deterministic materializer 用稳定 ID、确定性排序和集合式 upsert 保障重试安全。</w:t>
+      </w:r>
+    </w:p>
+    <w:p>
+      <w:pPr>
+        <w:pStyle w:val="a7"/>
+        <w:jc w:val="center"/>
+      </w:pPr>
+      <w:r>
+        <w:t>表格 4 RawMergeUnit 后续研究路线</w:t>
+      </w:r>
+    </w:p>
+    <w:tbl>
+      <w:tblPr>
+        <w:tblStyle w:val="afe"/>
+        <w:tblW w:type="auto" w:w="0"/>
+        <w:jc w:val="center"/>
+        <w:tblLayout w:type="fixed"/>
+        <w:tblLook w:firstColumn="1" w:firstRow="1" w:lastColumn="0" w:lastRow="0" w:noHBand="0" w:noVBand="1" w:val="04A0"/>
+      </w:tblPr>
+      <w:tblGrid>
+        <w:gridCol w:w="2255"/>
+        <w:gridCol w:w="2255"/>
+        <w:gridCol w:w="2255"/>
+        <w:gridCol w:w="2255"/>
+      </w:tblGrid>
+      <w:tr>
+        <w:tc>
+          <w:tcPr>
+            <w:tcW w:type="dxa" w:w="1512"/>
+            <w:vAlign w:val="center"/>
+            <w:shd w:fill="D9EAD3"/>
+          </w:tcPr>
+          <w:p>
+            <w:pPr>
+              <w:spacing w:after="0" w:before="0" w:line="252" w:lineRule="auto"/>
+              <w:jc w:val="center"/>
+            </w:pPr>
+            <w:r>
+              <w:rPr>
+                <w:b/>
+                <w:sz w:val="14"/>
+              </w:rPr>
+            </w:r>
+            <w:r>
+              <w:rPr>
+                <w:b/>
+                <w:sz w:val="14"/>
+              </w:rPr>
+              <w:t>方向</w:t>
+            </w:r>
+          </w:p>
+        </w:tc>
+        <w:tc>
+          <w:tcPr>
+            <w:tcW w:type="dxa" w:w="2808"/>
+            <w:vAlign w:val="center"/>
+            <w:shd w:fill="D9EAD3"/>
+          </w:tcPr>
+          <w:p>
+            <w:pPr>
+              <w:spacing w:after="0" w:before="0" w:line="252" w:lineRule="auto"/>
+              <w:jc w:val="center"/>
+            </w:pPr>
+            <w:r>
+              <w:rPr>
+                <w:b/>
+                <w:sz w:val="14"/>
+              </w:rPr>
+            </w:r>
+            <w:r>
+              <w:rPr>
+                <w:b/>
+                <w:sz w:val="14"/>
+              </w:rPr>
+              <w:t>设计文档机制</w:t>
+            </w:r>
+          </w:p>
+        </w:tc>
+        <w:tc>
+          <w:tcPr>
+            <w:tcW w:type="dxa" w:w="3528"/>
+            <w:vAlign w:val="center"/>
+            <w:shd w:fill="D9EAD3"/>
+          </w:tcPr>
+          <w:p>
+            <w:pPr>
+              <w:spacing w:after="0" w:before="0" w:line="252" w:lineRule="auto"/>
+              <w:jc w:val="center"/>
+            </w:pPr>
+            <w:r>
+              <w:rPr>
+                <w:b/>
+                <w:sz w:val="14"/>
+              </w:rPr>
+            </w:r>
+            <w:r>
+              <w:rPr>
+                <w:b/>
+                <w:sz w:val="14"/>
+              </w:rPr>
+              <w:t>ragent 落点</w:t>
+            </w:r>
+          </w:p>
+        </w:tc>
+        <w:tc>
+          <w:tcPr>
+            <w:tcW w:type="dxa" w:w="2664"/>
+            <w:vAlign w:val="center"/>
+            <w:shd w:fill="D9EAD3"/>
+          </w:tcPr>
+          <w:p>
+            <w:pPr>
+              <w:spacing w:after="0" w:before="0" w:line="252" w:lineRule="auto"/>
+              <w:jc w:val="center"/>
+            </w:pPr>
+            <w:r>
+              <w:rPr>
+                <w:b/>
+                <w:sz w:val="14"/>
+              </w:rPr>
+            </w:r>
+            <w:r>
+              <w:rPr>
+                <w:b/>
+                <w:sz w:val="14"/>
+              </w:rPr>
+              <w:t>验证指标</w:t>
+            </w:r>
+          </w:p>
+        </w:tc>
+      </w:tr>
+      <w:tr>
+        <w:tc>
+          <w:tcPr>
+            <w:tcW w:type="dxa" w:w="1512"/>
+            <w:vAlign w:val="center"/>
+          </w:tcPr>
+          <w:p>
+            <w:pPr>
+              <w:spacing w:after="0" w:before="0" w:line="252" w:lineRule="auto"/>
+              <w:jc w:val="left"/>
+            </w:pPr>
+            <w:r>
+              <w:rPr>
+                <w:sz w:val="13"/>
+              </w:rPr>
+            </w:r>
+            <w:r>
+              <w:rPr>
+                <w:b w:val="0"/>
+                <w:sz w:val="13"/>
+              </w:rPr>
+              <w:t>抽取与写图解耦</w:t>
+            </w:r>
+          </w:p>
+        </w:tc>
+        <w:tc>
+          <w:tcPr>
+            <w:tcW w:type="dxa" w:w="2808"/>
+            <w:vAlign w:val="center"/>
+          </w:tcPr>
+          <w:p>
+            <w:pPr>
+              <w:spacing w:after="0" w:before="0" w:line="252" w:lineRule="auto"/>
+              <w:jc w:val="left"/>
+            </w:pPr>
+            <w:r>
+              <w:rPr>
+                <w:sz w:val="13"/>
+              </w:rPr>
+            </w:r>
+            <w:r>
+              <w:rPr>
+                <w:b w:val="0"/>
+                <w:sz w:val="13"/>
+              </w:rPr>
+              <w:t>MentionEvent / RelationMentionEvent 与 append-only mention log</w:t>
+            </w:r>
+          </w:p>
+        </w:tc>
+        <w:tc>
+          <w:tcPr>
+            <w:tcW w:type="dxa" w:w="3528"/>
+            <w:vAlign w:val="center"/>
+          </w:tcPr>
+          <w:p>
+            <w:pPr>
+              <w:spacing w:after="0" w:before="0" w:line="252" w:lineRule="auto"/>
+              <w:jc w:val="left"/>
+            </w:pPr>
+            <w:r>
+              <w:rPr>
+                <w:sz w:val="13"/>
+              </w:rPr>
+            </w:r>
+            <w:r>
+              <w:rPr>
+                <w:b w:val="0"/>
+                <w:sz w:val="13"/>
+              </w:rPr>
+              <w:t>将 RawMergeUnit 扩展为可长期保存的 mention/event log，保留 surface、span、provenance、候选与抽取置信度</w:t>
+            </w:r>
+          </w:p>
+        </w:tc>
+        <w:tc>
+          <w:tcPr>
+            <w:tcW w:type="dxa" w:w="2664"/>
+            <w:vAlign w:val="center"/>
+          </w:tcPr>
+          <w:p>
+            <w:pPr>
+              <w:spacing w:after="0" w:before="0" w:line="252" w:lineRule="auto"/>
+              <w:jc w:val="left"/>
+            </w:pPr>
+            <w:r>
+              <w:rPr>
+                <w:sz w:val="13"/>
+              </w:rPr>
+            </w:r>
+            <w:r>
+              <w:rPr>
+                <w:b w:val="0"/>
+                <w:sz w:val="13"/>
+              </w:rPr>
+              <w:t>回放确定性、失败恢复率、provenance 完整度</w:t>
+            </w:r>
+          </w:p>
+        </w:tc>
+      </w:tr>
+      <w:tr>
+        <w:tc>
+          <w:tcPr>
+            <w:tcW w:type="dxa" w:w="1512"/>
+            <w:vAlign w:val="center"/>
+          </w:tcPr>
+          <w:p>
+            <w:pPr>
+              <w:spacing w:after="0" w:before="0" w:line="252" w:lineRule="auto"/>
+              <w:jc w:val="left"/>
+            </w:pPr>
+            <w:r>
+              <w:rPr>
+                <w:sz w:val="13"/>
+              </w:rPr>
+            </w:r>
+            <w:r>
+              <w:rPr>
+                <w:b w:val="0"/>
+                <w:sz w:val="13"/>
+              </w:rPr>
+              <w:t>Epoch 快照解析</w:t>
+            </w:r>
+          </w:p>
+        </w:tc>
+        <w:tc>
+          <w:tcPr>
+            <w:tcW w:type="dxa" w:w="2808"/>
+            <w:vAlign w:val="center"/>
+          </w:tcPr>
+          <w:p>
+            <w:pPr>
+              <w:spacing w:after="0" w:before="0" w:line="252" w:lineRule="auto"/>
+              <w:jc w:val="left"/>
+            </w:pPr>
+            <w:r>
+              <w:rPr>
+                <w:sz w:val="13"/>
+              </w:rPr>
+            </w:r>
+            <w:r>
+              <w:rPr>
+                <w:b w:val="0"/>
+                <w:sz w:val="13"/>
+              </w:rPr>
+              <w:t>固定 graph snapshot + tentative decision</w:t>
+            </w:r>
+          </w:p>
+        </w:tc>
+        <w:tc>
+          <w:tcPr>
+            <w:tcW w:type="dxa" w:w="3528"/>
+            <w:vAlign w:val="center"/>
+          </w:tcPr>
+          <w:p>
+            <w:pPr>
+              <w:spacing w:after="0" w:before="0" w:line="252" w:lineRule="auto"/>
+              <w:jc w:val="left"/>
+            </w:pPr>
+            <w:r>
+              <w:rPr>
+                <w:sz w:val="13"/>
+              </w:rPr>
+            </w:r>
+            <w:r>
+              <w:rPr>
+                <w:b w:val="0"/>
+                <w:sz w:val="13"/>
+              </w:rPr>
+              <w:t>实现 EpochBuilder、SnapshotManager 和基于快照的 candidate retriever，避免 worker 直接读写 live graph</w:t>
+            </w:r>
+          </w:p>
+        </w:tc>
+        <w:tc>
+          <w:tcPr>
+            <w:tcW w:type="dxa" w:w="2664"/>
+            <w:vAlign w:val="center"/>
+          </w:tcPr>
+          <w:p>
+            <w:pPr>
+              <w:spacing w:after="0" w:before="0" w:line="252" w:lineRule="auto"/>
+              <w:jc w:val="left"/>
+            </w:pPr>
+            <w:r>
+              <w:rPr>
+                <w:sz w:val="13"/>
+              </w:rPr>
+            </w:r>
+            <w:r>
+              <w:rPr>
+                <w:b w:val="0"/>
+                <w:sz w:val="13"/>
+              </w:rPr>
+              <w:t>replay determinism、重复实体率、热点实体吞吐</w:t>
+            </w:r>
+          </w:p>
+        </w:tc>
+      </w:tr>
+      <w:tr>
+        <w:tc>
+          <w:tcPr>
+            <w:tcW w:type="dxa" w:w="1512"/>
+            <w:vAlign w:val="center"/>
+          </w:tcPr>
+          <w:p>
+            <w:pPr>
+              <w:spacing w:after="0" w:before="0" w:line="252" w:lineRule="auto"/>
+              <w:jc w:val="left"/>
+            </w:pPr>
+            <w:r>
+              <w:rPr>
+                <w:sz w:val="13"/>
+              </w:rPr>
+            </w:r>
+            <w:r>
+              <w:rPr>
+                <w:b w:val="0"/>
+                <w:sz w:val="13"/>
+              </w:rPr>
+              <w:t>四分决策层</w:t>
+            </w:r>
+          </w:p>
+        </w:tc>
+        <w:tc>
+          <w:tcPr>
+            <w:tcW w:type="dxa" w:w="2808"/>
+            <w:vAlign w:val="center"/>
+          </w:tcPr>
+          <w:p>
+            <w:pPr>
+              <w:spacing w:after="0" w:before="0" w:line="252" w:lineRule="auto"/>
+              <w:jc w:val="left"/>
+            </w:pPr>
+            <w:r>
+              <w:rPr>
+                <w:sz w:val="13"/>
+              </w:rPr>
+            </w:r>
+            <w:r>
+              <w:rPr>
+                <w:b w:val="0"/>
+                <w:sz w:val="13"/>
+              </w:rPr>
+              <w:t>merge_existing / create_canonical / create_provisional / defer</w:t>
+            </w:r>
+          </w:p>
+        </w:tc>
+        <w:tc>
+          <w:tcPr>
+            <w:tcW w:type="dxa" w:w="3528"/>
+            <w:vAlign w:val="center"/>
+          </w:tcPr>
+          <w:p>
+            <w:pPr>
+              <w:spacing w:after="0" w:before="0" w:line="252" w:lineRule="auto"/>
+              <w:jc w:val="left"/>
+            </w:pPr>
+            <w:r>
+              <w:rPr>
+                <w:sz w:val="13"/>
+              </w:rPr>
+            </w:r>
+            <w:r>
+              <w:rPr>
+                <w:b w:val="0"/>
+                <w:sz w:val="13"/>
+              </w:rPr>
+              <w:t>增加 provisional layer 与 defer queue，区分“可安全新增”“暂定实体”和“证据不足”</w:t>
+            </w:r>
+          </w:p>
+        </w:tc>
+        <w:tc>
+          <w:tcPr>
+            <w:tcW w:type="dxa" w:w="2664"/>
+            <w:vAlign w:val="center"/>
+          </w:tcPr>
+          <w:p>
+            <w:pPr>
+              <w:spacing w:after="0" w:before="0" w:line="252" w:lineRule="auto"/>
+              <w:jc w:val="left"/>
+            </w:pPr>
+            <w:r>
+              <w:rPr>
+                <w:sz w:val="13"/>
+              </w:rPr>
+            </w:r>
+            <w:r>
+              <w:rPr>
+                <w:b w:val="0"/>
+                <w:sz w:val="13"/>
+              </w:rPr>
+              <w:t>wrong merge rate、provisional promotion rate、resolved-after-defer rate</w:t>
+            </w:r>
+          </w:p>
+        </w:tc>
+      </w:tr>
+      <w:tr>
+        <w:tc>
+          <w:tcPr>
+            <w:tcW w:type="dxa" w:w="1512"/>
+            <w:vAlign w:val="center"/>
+          </w:tcPr>
+          <w:p>
+            <w:pPr>
+              <w:spacing w:after="0" w:before="0" w:line="252" w:lineRule="auto"/>
+              <w:jc w:val="left"/>
+            </w:pPr>
+            <w:r>
+              <w:rPr>
+                <w:sz w:val="13"/>
+              </w:rPr>
+            </w:r>
+            <w:r>
+              <w:rPr>
+                <w:b w:val="0"/>
+                <w:sz w:val="13"/>
+              </w:rPr>
+              <w:t>确定性物化</w:t>
+            </w:r>
+          </w:p>
+        </w:tc>
+        <w:tc>
+          <w:tcPr>
+            <w:tcW w:type="dxa" w:w="2808"/>
+            <w:vAlign w:val="center"/>
+          </w:tcPr>
+          <w:p>
+            <w:pPr>
+              <w:spacing w:after="0" w:before="0" w:line="252" w:lineRule="auto"/>
+              <w:jc w:val="left"/>
+            </w:pPr>
+            <w:r>
+              <w:rPr>
+                <w:sz w:val="13"/>
+              </w:rPr>
+            </w:r>
+            <w:r>
+              <w:rPr>
+                <w:b w:val="0"/>
+                <w:sz w:val="13"/>
+              </w:rPr>
+              <w:t>stable IDs、decision sorter、conflict detector、set-based upsert</w:t>
+            </w:r>
+          </w:p>
+        </w:tc>
+        <w:tc>
+          <w:tcPr>
+            <w:tcW w:type="dxa" w:w="3528"/>
+            <w:vAlign w:val="center"/>
+          </w:tcPr>
+          <w:p>
+            <w:pPr>
+              <w:spacing w:after="0" w:before="0" w:line="252" w:lineRule="auto"/>
+              <w:jc w:val="left"/>
+            </w:pPr>
+            <w:r>
+              <w:rPr>
+                <w:sz w:val="13"/>
+              </w:rPr>
+            </w:r>
+            <w:r>
+              <w:rPr>
+                <w:b w:val="0"/>
+                <w:sz w:val="13"/>
+              </w:rPr>
+              <w:t>对 node、edge、evidence、source ids 使用稳定 ID 和集合式合并；CRDT-like 只用于证据集合，不宣称解决语义合并</w:t>
+            </w:r>
+          </w:p>
+        </w:tc>
+        <w:tc>
+          <w:tcPr>
+            <w:tcW w:type="dxa" w:w="2664"/>
+            <w:vAlign w:val="center"/>
+          </w:tcPr>
+          <w:p>
+            <w:pPr>
+              <w:spacing w:after="0" w:before="0" w:line="252" w:lineRule="auto"/>
+              <w:jc w:val="left"/>
+            </w:pPr>
+            <w:r>
+              <w:rPr>
+                <w:sz w:val="13"/>
+              </w:rPr>
+            </w:r>
+            <w:r>
+              <w:rPr>
+                <w:b w:val="0"/>
+                <w:sz w:val="13"/>
+              </w:rPr>
+              <w:t>dangling edge rate、幂等重跑一致性、source/evidence 去重率</w:t>
+            </w:r>
+          </w:p>
+        </w:tc>
+      </w:tr>
+      <w:tr>
+        <w:tc>
+          <w:tcPr>
+            <w:tcW w:type="dxa" w:w="1512"/>
+            <w:vAlign w:val="center"/>
+          </w:tcPr>
+          <w:p>
+            <w:pPr>
+              <w:spacing w:after="0" w:before="0" w:line="252" w:lineRule="auto"/>
+              <w:jc w:val="left"/>
+            </w:pPr>
+            <w:r>
+              <w:rPr>
+                <w:sz w:val="13"/>
+              </w:rPr>
+            </w:r>
+            <w:r>
+              <w:rPr>
+                <w:b w:val="0"/>
+                <w:sz w:val="13"/>
+              </w:rPr>
+              <w:t>评测与消融</w:t>
+            </w:r>
+          </w:p>
+        </w:tc>
+        <w:tc>
+          <w:tcPr>
+            <w:tcW w:type="dxa" w:w="2808"/>
+            <w:vAlign w:val="center"/>
+          </w:tcPr>
+          <w:p>
+            <w:pPr>
+              <w:spacing w:after="0" w:before="0" w:line="252" w:lineRule="auto"/>
+              <w:jc w:val="left"/>
+            </w:pPr>
+            <w:r>
+              <w:rPr>
+                <w:sz w:val="13"/>
+              </w:rPr>
+            </w:r>
+            <w:r>
+              <w:rPr>
+                <w:b w:val="0"/>
+                <w:sz w:val="13"/>
+              </w:rPr>
+              <w:t>synonym-heavy、homonym-heavy、skew、retry/failure workloads</w:t>
+            </w:r>
+          </w:p>
+        </w:tc>
+        <w:tc>
+          <w:tcPr>
+            <w:tcW w:type="dxa" w:w="3528"/>
+            <w:vAlign w:val="center"/>
+          </w:tcPr>
+          <w:p>
+            <w:pPr>
+              <w:spacing w:after="0" w:before="0" w:line="252" w:lineRule="auto"/>
+              <w:jc w:val="left"/>
+            </w:pPr>
+            <w:r>
+              <w:rPr>
+                <w:sz w:val="13"/>
+              </w:rPr>
+            </w:r>
+            <w:r>
+              <w:rPr>
+                <w:b w:val="0"/>
+                <w:sz w:val="13"/>
+              </w:rPr>
+              <w:t>在真实语料外补充可控压力集，对比 direct write、serial resolution、batch ER、full system</w:t>
+            </w:r>
+          </w:p>
+        </w:tc>
+        <w:tc>
+          <w:tcPr>
+            <w:tcW w:type="dxa" w:w="2664"/>
+            <w:vAlign w:val="center"/>
+          </w:tcPr>
+          <w:p>
+            <w:pPr>
+              <w:spacing w:after="0" w:before="0" w:line="252" w:lineRule="auto"/>
+              <w:jc w:val="left"/>
+            </w:pPr>
+            <w:r>
+              <w:rPr>
+                <w:sz w:val="13"/>
+              </w:rPr>
+            </w:r>
+            <w:r>
+              <w:rPr>
+                <w:b w:val="0"/>
+                <w:sz w:val="13"/>
+              </w:rPr>
+              <w:t>entity F1、duplicate rate、defer rate、latency per epoch、throughput</w:t>
+            </w:r>
+          </w:p>
+        </w:tc>
+      </w:tr>
+    </w:tbl>
+    <w:p>
+      <w:r>
+        <w:t>因此，RawMergeUnit 后续不应只被描述为导入导出工具，而应成为“抽取日志、epoch 解析、四分决策、确定性物化、可重放评测”这一整条研究链路的承载结构。工程上先实现 mention log 与 epoch coordinator，随后补上 provisional/defer 生命周期和 replay determinism 测试；论文或技术报告上则避免把 CRDT、事务协议或 epoch 准确率提升过度包装，重点证明稳定性、可恢复性、错误合并控制和新实体受控增长。</w:t>
       </w:r>
     </w:p>
     <w:p>
@@ -7189,6 +8829,7 @@
     <w:p>
       <w:pPr>
         <w:spacing w:line="360" w:lineRule="auto"/>
+        <w:jc w:val="left"/>
       </w:pPr>
       <w:r>
         <w:t xml:space="preserve">ragent </w:t>
@@ -7294,9 +8935,12 @@
       </w:r>
     </w:p>
     <w:p>
-      <w:pPr/>
-      <w:r>
-        <w:t>4 月 17 日后的新增证据模块还包括 ragent/kg/sqlite_kv_impl.py、ragent/kg/sqlite_query_cache_impl.py、ragent/keyword_extraction.py、ragent/offline_replay.py、ragent/inference_runtime.py、ragent/portable_paths.py、ragent/benchmarking.py、ragent/api/benchmark_service.py，以及 tools/export_raw_merge_units.py、tools/replay_raw_merge_units_to_project.py、tools/merge_raw_units_canonical.py、tools/merge_kg_projects.py 和 benchmark/keyword_cache_benefit.py。相关验证可参考 tests/test_query_cache_semantics.py、tests/test_sqlite_query_cache_storage.py、tests/test_ragent_revision_semantics.py、tests/test_keyword_extraction_fallback.py、tests/test_offline_replay_matches_online.py、tests/test_bulk_raw_units_tools.py、tests/test_merge_kg_projects.py 与 tests/test_mineru_output_naming.py。</w:t>
+      <w:pPr>
+        <w:pageBreakBefore w:val="0"/>
+        <w:jc w:val="left"/>
+      </w:pPr>
+      <w:r>
+        <w:t>4 月 17 日后的新增证据模块还包括 ragent/kg/sqlite_kv_impl.py、ragent/kg/sqlite_query_cache_impl.py、ragent/keyword_extraction.py、ragent/offline_replay.py、ragent/inference_runtime.py、ragent/benchmarking.py、ragent/api/benchmark_service.py，以及 tools/export_raw_merge_units.py、tools/replay_raw_merge_units_to_project.py、tools/merge_raw_units_canonical.py、tools/merge_kg_projects.py 和 benchmark/keyword_cache_benefit.py。相关验证可参考 tests/test_query_cache_semantics.py、tests/test_sqlite_query_cache_storage.py、tests/test_ragent_revision_semantics.py、tests/test_keyword_extraction_fallback.py、tests/test_offline_replay_matches_online.py、tests/test_bulk_raw_units_tools.py、tests/test_merge_kg_projects.py。</w:t>
       </w:r>
     </w:p>
     <w:p>

</xml_diff>